<commit_message>
Revise branded proposal to hybrid pricing (fixed fee + 10% per-student commission)
Client-agreed model change: lower fixed fee with a success commission.
- Financial section now shows two side-by-side cards: fixed fee SAR 3,900 and
  10% success commission per new student registered through the site.
- Adds a commission-tracking note and a monthly-settlement payment term.
- Minor: recipient wording to "مدارس الفلك المنير".

Co-Authored-By: Claude Opus 4.8 <noreply@anthropic.com>
Claude-Session: https://claude.ai/code/session_01W7sPUkobsdvRc2MY817949
</commit_message>
<xml_diff>
--- a/marketing-al-falak-al-muneer/Proposal-AlFalak-AlMuneer-Branded.docx
+++ b/marketing-al-falak-al-muneer/Proposal-AlFalak-AlMuneer-Branded.docx
@@ -68,7 +68,7 @@
           <w:szCs w:val="20"/>
           <w:rtl/>
         </w:rPr>
-        <w:t xml:space="preserve">مُقدَّم إلى: إدارة مدرسة الفلك المنير      •      التاريخ: يوليو 2026      •      صلاحية العرض: 7 أيام</w:t>
+        <w:t xml:space="preserve">مُقدَّم إلى: إدارة مدارس الفلك المنير      •      التاريخ: يوليو 2026      •      صلاحية العرض: 7 أيام</w:t>
       </w:r>
     </w:p>
     <w:p>
@@ -1424,16 +1424,8 @@
     </w:p>
     <w:p>
       <w:pPr>
-        <w:pBdr>
-          <w:top w:val="single" w:sz="14" w:space="6" w:color="F4612C"/>
-          <w:left w:val="single" w:sz="14" w:space="6" w:color="F4612C"/>
-          <w:bottom w:val="single" w:sz="14" w:space="6" w:color="F4612C"/>
-          <w:right w:val="single" w:sz="14" w:space="6" w:color="F4612C"/>
-        </w:pBdr>
-        <w:shd w:val="clear" w:color="auto" w:fill="FFF4E0"/>
-        <w:bidi/>
-        <w:spacing w:before="120" w:after="120" w:line="460" w:lineRule="auto"/>
-        <w:ind w:start="120" w:end="120"/>
+        <w:bidi/>
+        <w:spacing w:before="30" w:after="100" w:line="280" w:lineRule="auto"/>
         <w:jc w:val="center"/>
       </w:pPr>
       <w:r>
@@ -1442,23 +1434,220 @@
           <w:b/>
           <w:bCs/>
           <w:color w:val="4A1FA0"/>
-          <w:sz w:val="24"/>
-          <w:szCs w:val="24"/>
-          <w:rtl/>
-        </w:rPr>
-        <w:t xml:space="preserve">قيمة المشروع:   </w:t>
-      </w:r>
-      <w:r>
-        <w:rPr>
-          <w:rFonts w:ascii="Cairo" w:hAnsi="Cairo" w:cs="Cairo"/>
-          <w:b/>
-          <w:bCs/>
-          <w:color w:val="F4612C"/>
-          <w:sz w:val="44"/>
-          <w:szCs w:val="44"/>
-          <w:rtl/>
-        </w:rPr>
-        <w:t xml:space="preserve">8,500 ريال سعودي</w:t>
+          <w:sz w:val="20"/>
+          <w:szCs w:val="20"/>
+          <w:rtl/>
+        </w:rPr>
+        <w:t xml:space="preserve">نموذج شراكة: رسوم ثابتة منخفضة + عمولة عند تحقيق التسجيلات — نجاحنا مرتبط بنجاحكم.</w:t>
+      </w:r>
+    </w:p>
+    <w:tbl>
+      <w:tblPr>
+        <w:bidiVisual/>
+        <w:tblW w:w="9640" w:type="dxa"/>
+        <w:jc w:val="center"/>
+        <w:tblLook w:val="0000" w:firstRow="0" w:lastRow="0" w:firstColumn="0" w:lastColumn="0" w:noHBand="1" w:noVBand="1"/>
+      </w:tblPr>
+      <w:tblGrid>
+        <w:gridCol w:w="4560"/>
+        <w:gridCol w:w="520"/>
+        <w:gridCol w:w="4560"/>
+      </w:tblGrid>
+      <w:tr>
+        <w:tc>
+          <w:tcPr>
+            <w:tcW w:w="4560" w:type="dxa"/>
+            <w:tcBorders>
+              <w:top w:val="single" w:sz="14" w:space="0" w:color="F4612C"/>
+              <w:left w:val="single" w:sz="14" w:space="0" w:color="F4612C"/>
+              <w:bottom w:val="single" w:sz="14" w:space="0" w:color="F4612C"/>
+              <w:right w:val="single" w:sz="14" w:space="0" w:color="F4612C"/>
+            </w:tcBorders>
+            <w:shd w:val="clear" w:color="auto" w:fill="FFF4E0"/>
+            <w:tcMar>
+              <w:top w:w="140" w:type="dxa"/>
+              <w:left w:w="120" w:type="dxa"/>
+              <w:bottom w:w="140" w:type="dxa"/>
+              <w:right w:w="120" w:type="dxa"/>
+            </w:tcMar>
+            <w:vAlign w:val="center"/>
+          </w:tcPr>
+          <w:p>
+            <w:pPr>
+              <w:bidi/>
+              <w:spacing w:before="20" w:after="20" w:line="300" w:lineRule="auto"/>
+              <w:jc w:val="center"/>
+            </w:pPr>
+            <w:r>
+              <w:rPr>
+                <w:rFonts w:ascii="Cairo" w:hAnsi="Cairo" w:cs="Cairo"/>
+                <w:b/>
+                <w:bCs/>
+                <w:color w:val="4A1FA0"/>
+                <w:sz w:val="22"/>
+                <w:szCs w:val="22"/>
+                <w:rtl/>
+              </w:rPr>
+              <w:t xml:space="preserve">الرسوم الثابتة</w:t>
+            </w:r>
+          </w:p>
+          <w:p>
+            <w:pPr>
+              <w:bidi/>
+              <w:spacing w:before="0" w:after="20" w:line="560" w:lineRule="auto"/>
+              <w:jc w:val="center"/>
+            </w:pPr>
+            <w:r>
+              <w:rPr>
+                <w:rFonts w:ascii="Cairo" w:hAnsi="Cairo" w:cs="Cairo"/>
+                <w:b/>
+                <w:bCs/>
+                <w:color w:val="F4612C"/>
+                <w:sz w:val="48"/>
+                <w:szCs w:val="48"/>
+                <w:rtl/>
+              </w:rPr>
+              <w:t xml:space="preserve">3,900</w:t>
+            </w:r>
+            <w:r>
+              <w:rPr>
+                <w:rFonts w:ascii="Cairo" w:hAnsi="Cairo" w:cs="Cairo"/>
+                <w:b/>
+                <w:bCs/>
+                <w:color w:val="F4612C"/>
+                <w:sz w:val="24"/>
+                <w:szCs w:val="24"/>
+                <w:rtl/>
+              </w:rPr>
+              <w:t xml:space="preserve"> ريال</w:t>
+            </w:r>
+          </w:p>
+          <w:p>
+            <w:pPr>
+              <w:bidi/>
+              <w:spacing w:before="0" w:after="20" w:line="240" w:lineRule="auto"/>
+              <w:jc w:val="center"/>
+            </w:pPr>
+            <w:r>
+              <w:rPr>
+                <w:rFonts w:ascii="Cairo" w:hAnsi="Cairo" w:cs="Cairo"/>
+                <w:color w:val="3A3A4A"/>
+                <w:sz w:val="17"/>
+                <w:szCs w:val="17"/>
+                <w:rtl/>
+              </w:rPr>
+              <w:t xml:space="preserve">إنتاج + تنفيذ + إدارة الحملة 30 يوماً</w:t>
+            </w:r>
+          </w:p>
+        </w:tc>
+        <w:tc>
+          <w:tcPr>
+            <w:tcW w:w="520" w:type="dxa"/>
+            <w:tcBorders>
+              <w:top w:val="nil"/>
+              <w:left w:val="nil"/>
+              <w:bottom w:val="nil"/>
+              <w:right w:val="nil"/>
+            </w:tcBorders>
+          </w:tcPr>
+          <w:p>
+            <w:pPr>
+              <w:bidi/>
+              <w:spacing w:after="0" w:line="60" w:lineRule="exact"/>
+            </w:pPr>
+          </w:p>
+        </w:tc>
+        <w:tc>
+          <w:tcPr>
+            <w:tcW w:w="4560" w:type="dxa"/>
+            <w:tcBorders>
+              <w:top w:val="single" w:sz="14" w:space="0" w:color="4A1FA0"/>
+              <w:left w:val="single" w:sz="14" w:space="0" w:color="4A1FA0"/>
+              <w:bottom w:val="single" w:sz="14" w:space="0" w:color="4A1FA0"/>
+              <w:right w:val="single" w:sz="14" w:space="0" w:color="4A1FA0"/>
+            </w:tcBorders>
+            <w:shd w:val="clear" w:color="auto" w:fill="F0EAFB"/>
+            <w:tcMar>
+              <w:top w:w="140" w:type="dxa"/>
+              <w:left w:w="120" w:type="dxa"/>
+              <w:bottom w:w="140" w:type="dxa"/>
+              <w:right w:w="120" w:type="dxa"/>
+            </w:tcMar>
+            <w:vAlign w:val="center"/>
+          </w:tcPr>
+          <w:p>
+            <w:pPr>
+              <w:bidi/>
+              <w:spacing w:before="20" w:after="20" w:line="300" w:lineRule="auto"/>
+              <w:jc w:val="center"/>
+            </w:pPr>
+            <w:r>
+              <w:rPr>
+                <w:rFonts w:ascii="Cairo" w:hAnsi="Cairo" w:cs="Cairo"/>
+                <w:b/>
+                <w:bCs/>
+                <w:color w:val="F4612C"/>
+                <w:sz w:val="22"/>
+                <w:szCs w:val="22"/>
+                <w:rtl/>
+              </w:rPr>
+              <w:t xml:space="preserve">عمولة النجاح</w:t>
+            </w:r>
+          </w:p>
+          <w:p>
+            <w:pPr>
+              <w:bidi/>
+              <w:spacing w:before="0" w:after="20" w:line="560" w:lineRule="auto"/>
+              <w:jc w:val="center"/>
+            </w:pPr>
+            <w:r>
+              <w:rPr>
+                <w:rFonts w:ascii="Cairo" w:hAnsi="Cairo" w:cs="Cairo"/>
+                <w:b/>
+                <w:bCs/>
+                <w:color w:val="4A1FA0"/>
+                <w:sz w:val="48"/>
+                <w:szCs w:val="48"/>
+                <w:rtl/>
+              </w:rPr>
+              <w:t xml:space="preserve">10%</w:t>
+            </w:r>
+          </w:p>
+          <w:p>
+            <w:pPr>
+              <w:bidi/>
+              <w:spacing w:before="0" w:after="20" w:line="240" w:lineRule="auto"/>
+              <w:jc w:val="center"/>
+            </w:pPr>
+            <w:r>
+              <w:rPr>
+                <w:rFonts w:ascii="Cairo" w:hAnsi="Cairo" w:cs="Cairo"/>
+                <w:color w:val="3A3A4A"/>
+                <w:sz w:val="17"/>
+                <w:szCs w:val="17"/>
+                <w:rtl/>
+              </w:rPr>
+              <w:t xml:space="preserve">لكل طالب جديد يُسجَّل عبر الموقع</w:t>
+            </w:r>
+          </w:p>
+        </w:tc>
+      </w:tr>
+    </w:tbl>
+    <w:p>
+      <w:pPr>
+        <w:bidi/>
+        <w:spacing w:before="120" w:after="40" w:line="260" w:lineRule="auto"/>
+        <w:jc w:val="center"/>
+      </w:pPr>
+      <w:r>
+        <w:rPr>
+          <w:rFonts w:ascii="Cairo" w:hAnsi="Cairo" w:cs="Cairo"/>
+          <w:color w:val="3A3A4A"/>
+          <w:sz w:val="18"/>
+          <w:szCs w:val="18"/>
+          <w:rtl/>
+        </w:rPr>
+        <w:t xml:space="preserve">تُحتسب عمولة النجاح من رسوم التسجيل لكل طالب جديد يُسجَّل فعلياً عبر نموذج الموقع، مع تقرير دوري بأعداد المسجَّلين.</w:t>
       </w:r>
     </w:p>
     <w:p>
@@ -1769,7 +1958,7 @@
           <w:szCs w:val="22"/>
           <w:rtl/>
         </w:rPr>
-        <w:t xml:space="preserve">50% عند توقيع الاتفاق.</w:t>
+        <w:t xml:space="preserve">50% من الرسوم الثابتة عند توقيع الاتفاق.</w:t>
       </w:r>
     </w:p>
     <w:p>
@@ -1801,6 +1990,37 @@
           <w:rtl/>
         </w:rPr>
         <w:t xml:space="preserve">50% عند إطلاق الحملة.</w:t>
+      </w:r>
+    </w:p>
+    <w:p>
+      <w:pPr>
+        <w:bidi/>
+        <w:spacing w:before="18" w:after="18" w:line="252" w:lineRule="auto"/>
+        <w:ind w:start="360" w:hanging="280"/>
+        <w:contextualSpacing/>
+        <w:jc w:val="right"/>
+      </w:pPr>
+      <w:r>
+        <w:rPr>
+          <w:rFonts w:ascii="Cairo" w:hAnsi="Cairo" w:cs="Cairo"/>
+          <w:b/>
+          <w:bCs/>
+          <w:color w:val="4A1FA0"/>
+          <w:sz w:val="22"/>
+          <w:szCs w:val="22"/>
+          <w:rtl/>
+        </w:rPr>
+        <w:t xml:space="preserve">•  </w:t>
+      </w:r>
+      <w:r>
+        <w:rPr>
+          <w:rFonts w:ascii="Cairo" w:hAnsi="Cairo" w:cs="Cairo"/>
+          <w:color w:val="3A3A4A"/>
+          <w:sz w:val="22"/>
+          <w:szCs w:val="22"/>
+          <w:rtl/>
+        </w:rPr>
+        <w:t xml:space="preserve">عمولة النجاح (10%) تُحتسب وتُسدَّد شهرياً وفق تقرير المسجَّلين عبر الموقع.</w:t>
       </w:r>
     </w:p>
     <w:p>
@@ -1825,7 +2045,7 @@
           <w:szCs w:val="21"/>
           <w:rtl/>
         </w:rPr>
-        <w:t xml:space="preserve">نتطلّع إلى شراكة ناجحة تُحقّق أهداف مدرسة الفلك المنير في موسم التسجيل.</w:t>
+        <w:t xml:space="preserve">نتطلّع إلى شراكة ناجحة تُحقّق أهداف مدارس الفلك المنير في موسم التسجيل.</w:t>
       </w:r>
     </w:p>
     <w:sectPr>

</xml_diff>

<commit_message>
Restructure branded proposal into 3 paid work phases with VAT breakdown
Client accepted at SAR 6,000 split across three phases, each paid before
execution, plus 15% VAT.
- Scope reorganized into 3 phases (produce -> build -> launch), each with a
  "pay before starting: 2,300 (incl. VAT)" strip.
- Financial section replaced with a VAT table: 3x 2,000 + 300 = 2,300, totals
  6,000 + 900 VAT = 6,900.
- Removed the 10% per-student commission model (flat price now).
- Renamed the landing page to a Google-searchable school website and added a
  brief note (ongoing engagement + Google presence).

Co-Authored-By: Claude Opus 4.8 <noreply@anthropic.com>
Claude-Session: https://claude.ai/code/session_01W7sPUkobsdvRc2MY817949
</commit_message>
<xml_diff>
--- a/marketing-al-falak-al-muneer/Proposal-AlFalak-AlMuneer-Branded.docx
+++ b/marketing-al-falak-al-muneer/Proposal-AlFalak-AlMuneer-Branded.docx
@@ -112,7 +112,7 @@
           <w:szCs w:val="22"/>
           <w:rtl/>
         </w:rPr>
-        <w:t xml:space="preserve">يسرّنا تقديم هذا العرض لتنفيذ حملة تسويقية متكاملة تهدف إلى زيادة عدد الطلاب المسجَّلين في المدرسة خلال فترة التسجيل، من خلال إنتاج محتوى إعلاني احترافي وإطلاق حملات إعلانية رقمية موجَّهة تستهدف أولياء الأمور في المنطقة.</w:t>
+        <w:t xml:space="preserve">يسرّنا تقديم هذا العرض لتنفيذ حملة تسويقية متكاملة لاستقطاب الطلاب في موسم التسجيل، منظَّمة على ثلاث مراحل عمل واضحة تشمل إنتاج محتوى إعلاني احترافي، وبناء موقع إلكتروني للمدرسة، وإطلاق حملات رقمية موجَّهة لأولياء الأمور في المنطقة.</w:t>
       </w:r>
     </w:p>
     <w:p>
@@ -134,7 +134,7 @@
           <w:szCs w:val="28"/>
           <w:rtl/>
         </w:rPr>
-        <w:t xml:space="preserve">أولاً: العرض الفني</w:t>
+        <w:t xml:space="preserve">أولاً: خطة العمل على ثلاث مراحل</w:t>
       </w:r>
     </w:p>
     <w:p>
@@ -155,7 +155,7 @@
           <w:szCs w:val="24"/>
           <w:rtl/>
         </w:rPr>
-        <w:t xml:space="preserve">١.  التخطيط الإبداعي للحملة</w:t>
+        <w:t xml:space="preserve">المرحلة الأولى — التخطيط والإنتاج</w:t>
       </w:r>
     </w:p>
     <w:p>
@@ -186,7 +186,7 @@
           <w:szCs w:val="22"/>
           <w:rtl/>
         </w:rPr>
-        <w:t xml:space="preserve">دراسة أهداف المدرسة والفئة المستهدفة.</w:t>
+        <w:t xml:space="preserve">دراسة أهداف المدرسة والفئة المستهدفة، وإعداد الفكرة الإبداعية والرسالة التسويقية.</w:t>
       </w:r>
     </w:p>
     <w:p>
@@ -217,7 +217,7 @@
           <w:szCs w:val="22"/>
           <w:rtl/>
         </w:rPr>
-        <w:t xml:space="preserve">إعداد الفكرة الإبداعية للحملة.</w:t>
+        <w:t xml:space="preserve">كتابة سيناريو الفيديو، وتحديد أماكن وزوايا التصوير، وإعداد خطة التنفيذ.</w:t>
       </w:r>
     </w:p>
     <w:p>
@@ -248,7 +248,7 @@
           <w:szCs w:val="22"/>
           <w:rtl/>
         </w:rPr>
-        <w:t xml:space="preserve">كتابة الرسالة التسويقية.</w:t>
+        <w:t xml:space="preserve">تصوير فيديو إعلاني احترافي (30 – 60 ثانية) يُبرز البيئة التعليمية والمرافق والأنشطة.</w:t>
       </w:r>
     </w:p>
     <w:p>
@@ -279,7 +279,61 @@
           <w:szCs w:val="22"/>
           <w:rtl/>
         </w:rPr>
-        <w:t xml:space="preserve">كتابة سيناريو الفيديو الإعلاني.</w:t>
+        <w:t xml:space="preserve">مونتاج احترافي مع النصوص والمؤثرات، وإخراج نسخ مناسبة لسناب شات وإنستغرام وتيك توك.</w:t>
+      </w:r>
+    </w:p>
+    <w:p>
+      <w:pPr>
+        <w:shd w:val="clear" w:color="auto" w:fill="FFF4E0"/>
+        <w:bidi/>
+        <w:spacing w:before="30" w:after="150" w:line="320" w:lineRule="auto"/>
+        <w:ind w:start="170" w:end="170"/>
+        <w:jc w:val="right"/>
+      </w:pPr>
+      <w:r>
+        <w:rPr>
+          <w:rFonts w:ascii="Cairo" w:hAnsi="Cairo" w:cs="Cairo"/>
+          <w:b/>
+          <w:bCs/>
+          <w:color w:val="4A1FA0"/>
+          <w:sz w:val="20"/>
+          <w:szCs w:val="20"/>
+          <w:rtl/>
+        </w:rPr>
+        <w:t xml:space="preserve">الدفعة قبل بدء المرحلة:  </w:t>
+      </w:r>
+      <w:r>
+        <w:rPr>
+          <w:rFonts w:ascii="Cairo" w:hAnsi="Cairo" w:cs="Cairo"/>
+          <w:b/>
+          <w:bCs/>
+          <w:color w:val="F4612C"/>
+          <w:sz w:val="22"/>
+          <w:szCs w:val="22"/>
+          <w:rtl/>
+        </w:rPr>
+        <w:t xml:space="preserve">2,300 ريال (شاملة الضريبة)</w:t>
+      </w:r>
+    </w:p>
+    <w:p>
+      <w:pPr>
+        <w:shd w:val="clear" w:color="auto" w:fill="4A1FA0"/>
+        <w:bidi/>
+        <w:spacing w:before="140" w:after="60" w:line="300" w:lineRule="auto"/>
+        <w:ind w:start="200" w:end="200"/>
+        <w:jc w:val="right"/>
+      </w:pPr>
+      <w:r>
+        <w:rPr>
+          <w:rFonts w:ascii="Cairo" w:hAnsi="Cairo" w:cs="Cairo"/>
+          <w:b/>
+          <w:bCs/>
+          <w:color w:val="FFFFFF"/>
+          <w:sz w:val="24"/>
+          <w:szCs w:val="24"/>
+          <w:rtl/>
+        </w:rPr>
+        <w:t xml:space="preserve">المرحلة الثانية — البناء الرقمي</w:t>
       </w:r>
     </w:p>
     <w:p>
@@ -310,7 +364,7 @@
           <w:szCs w:val="22"/>
           <w:rtl/>
         </w:rPr>
-        <w:t xml:space="preserve">تحديد أماكن وزوايا التصوير.</w:t>
+        <w:t xml:space="preserve">تصميم موقع إلكتروني للمدرسة يظهر في بحث Google، متوافق مع الجوال، مع المحتوى التسويقي وعرض المميزات وزر «سجّل الآن».</w:t>
       </w:r>
     </w:p>
     <w:p>
@@ -341,28 +395,7 @@
           <w:szCs w:val="22"/>
           <w:rtl/>
         </w:rPr>
-        <w:t xml:space="preserve">إعداد خطة تنفيذ الحملة.</w:t>
-      </w:r>
-    </w:p>
-    <w:p>
-      <w:pPr>
-        <w:shd w:val="clear" w:color="auto" w:fill="4A1FA0"/>
-        <w:bidi/>
-        <w:spacing w:before="140" w:after="60" w:line="300" w:lineRule="auto"/>
-        <w:ind w:start="200" w:end="200"/>
-        <w:jc w:val="right"/>
-      </w:pPr>
-      <w:r>
-        <w:rPr>
-          <w:rFonts w:ascii="Cairo" w:hAnsi="Cairo" w:cs="Cairo"/>
-          <w:b/>
-          <w:bCs/>
-          <w:color w:val="FFFFFF"/>
-          <w:sz w:val="24"/>
-          <w:szCs w:val="24"/>
-          <w:rtl/>
-        </w:rPr>
-        <w:t xml:space="preserve">٢.  إنتاج الفيديو الإعلاني</w:t>
+        <w:t xml:space="preserve">إنشاء نموذج التسجيل (اسم ولي الأمر، الأب/الأم، رقم الجوال، المرحلة والصف) وإرسال البيانات مباشرةً للإدارة.</w:t>
       </w:r>
     </w:p>
     <w:p>
@@ -393,7 +426,61 @@
           <w:szCs w:val="22"/>
           <w:rtl/>
         </w:rPr>
-        <w:t xml:space="preserve">تصوير فيديو احترافي (30 – 60 ثانية).</w:t>
+        <w:t xml:space="preserve">إعداد الحملات الإعلانية: الجمهور المستهدف، والمناطق الجغرافية، وأهداف الحملة، وتركيب Pixel وأدوات التتبّع، وربط الموقع بالحملات.</w:t>
+      </w:r>
+    </w:p>
+    <w:p>
+      <w:pPr>
+        <w:shd w:val="clear" w:color="auto" w:fill="FFF4E0"/>
+        <w:bidi/>
+        <w:spacing w:before="30" w:after="150" w:line="320" w:lineRule="auto"/>
+        <w:ind w:start="170" w:end="170"/>
+        <w:jc w:val="right"/>
+      </w:pPr>
+      <w:r>
+        <w:rPr>
+          <w:rFonts w:ascii="Cairo" w:hAnsi="Cairo" w:cs="Cairo"/>
+          <w:b/>
+          <w:bCs/>
+          <w:color w:val="4A1FA0"/>
+          <w:sz w:val="20"/>
+          <w:szCs w:val="20"/>
+          <w:rtl/>
+        </w:rPr>
+        <w:t xml:space="preserve">الدفعة قبل بدء المرحلة:  </w:t>
+      </w:r>
+      <w:r>
+        <w:rPr>
+          <w:rFonts w:ascii="Cairo" w:hAnsi="Cairo" w:cs="Cairo"/>
+          <w:b/>
+          <w:bCs/>
+          <w:color w:val="F4612C"/>
+          <w:sz w:val="22"/>
+          <w:szCs w:val="22"/>
+          <w:rtl/>
+        </w:rPr>
+        <w:t xml:space="preserve">2,300 ريال (شاملة الضريبة)</w:t>
+      </w:r>
+    </w:p>
+    <w:p>
+      <w:pPr>
+        <w:shd w:val="clear" w:color="auto" w:fill="4A1FA0"/>
+        <w:bidi/>
+        <w:spacing w:before="140" w:after="60" w:line="300" w:lineRule="auto"/>
+        <w:ind w:start="200" w:end="200"/>
+        <w:jc w:val="right"/>
+      </w:pPr>
+      <w:r>
+        <w:rPr>
+          <w:rFonts w:ascii="Cairo" w:hAnsi="Cairo" w:cs="Cairo"/>
+          <w:b/>
+          <w:bCs/>
+          <w:color w:val="FFFFFF"/>
+          <w:sz w:val="24"/>
+          <w:szCs w:val="24"/>
+          <w:rtl/>
+        </w:rPr>
+        <w:t xml:space="preserve">المرحلة الثالثة — الإطلاق والإدارة</w:t>
       </w:r>
     </w:p>
     <w:p>
@@ -424,7 +511,7 @@
           <w:szCs w:val="22"/>
           <w:rtl/>
         </w:rPr>
-        <w:t xml:space="preserve">إبراز البيئة التعليمية والمرافق.</w:t>
+        <w:t xml:space="preserve">إطلاق الحملات الإعلانية على سناب شات وإنستغرام وتيك توك، وعلى Google عبر الموقع.</w:t>
       </w:r>
     </w:p>
     <w:p>
@@ -455,7 +542,7 @@
           <w:szCs w:val="22"/>
           <w:rtl/>
         </w:rPr>
-        <w:t xml:space="preserve">تصوير الفصول والمعامل والساحات.</w:t>
+        <w:t xml:space="preserve">إدارة الحملة لمدة 30 يوماً: متابعة الأداء، وتحسين الإعلانات، واختبار أكثر من إعلان لخفض تكلفة الطالب.</w:t>
       </w:r>
     </w:p>
     <w:p>
@@ -486,15 +573,15 @@
           <w:szCs w:val="22"/>
           <w:rtl/>
         </w:rPr>
-        <w:t xml:space="preserve">تصوير الأنشطة والمرافق المتاحة.</w:t>
-      </w:r>
-    </w:p>
-    <w:p>
-      <w:pPr>
-        <w:bidi/>
-        <w:spacing w:before="18" w:after="18" w:line="252" w:lineRule="auto"/>
-        <w:ind w:start="360" w:hanging="280"/>
-        <w:contextualSpacing/>
+        <w:t xml:space="preserve">التقرير النهائي: عدد الطلبات، ونتائج الحملة، وأداء الإعلانات، والتوصيات المستقبلية.</w:t>
+      </w:r>
+    </w:p>
+    <w:p>
+      <w:pPr>
+        <w:shd w:val="clear" w:color="auto" w:fill="FFF4E0"/>
+        <w:bidi/>
+        <w:spacing w:before="30" w:after="150" w:line="320" w:lineRule="auto"/>
+        <w:ind w:start="170" w:end="170"/>
         <w:jc w:val="right"/>
       </w:pPr>
       <w:r>
@@ -502,902 +589,24 @@
           <w:rFonts w:ascii="Cairo" w:hAnsi="Cairo" w:cs="Cairo"/>
           <w:b/>
           <w:bCs/>
+          <w:color w:val="4A1FA0"/>
+          <w:sz w:val="20"/>
+          <w:szCs w:val="20"/>
+          <w:rtl/>
+        </w:rPr>
+        <w:t xml:space="preserve">الدفعة قبل بدء المرحلة:  </w:t>
+      </w:r>
+      <w:r>
+        <w:rPr>
+          <w:rFonts w:ascii="Cairo" w:hAnsi="Cairo" w:cs="Cairo"/>
+          <w:b/>
+          <w:bCs/>
           <w:color w:val="F4612C"/>
           <w:sz w:val="22"/>
           <w:szCs w:val="22"/>
           <w:rtl/>
         </w:rPr>
-        <w:t xml:space="preserve">•  </w:t>
-      </w:r>
-      <w:r>
-        <w:rPr>
-          <w:rFonts w:ascii="Cairo" w:hAnsi="Cairo" w:cs="Cairo"/>
-          <w:color w:val="3A3A4A"/>
-          <w:sz w:val="22"/>
-          <w:szCs w:val="22"/>
-          <w:rtl/>
-        </w:rPr>
-        <w:t xml:space="preserve">استخدام معدات تصوير احترافية.</w:t>
-      </w:r>
-    </w:p>
-    <w:p>
-      <w:pPr>
-        <w:bidi/>
-        <w:spacing w:before="18" w:after="18" w:line="252" w:lineRule="auto"/>
-        <w:ind w:start="360" w:hanging="280"/>
-        <w:contextualSpacing/>
-        <w:jc w:val="right"/>
-      </w:pPr>
-      <w:r>
-        <w:rPr>
-          <w:rFonts w:ascii="Cairo" w:hAnsi="Cairo" w:cs="Cairo"/>
-          <w:b/>
-          <w:bCs/>
-          <w:color w:val="F4612C"/>
-          <w:sz w:val="22"/>
-          <w:szCs w:val="22"/>
-          <w:rtl/>
-        </w:rPr>
-        <w:t xml:space="preserve">•  </w:t>
-      </w:r>
-      <w:r>
-        <w:rPr>
-          <w:rFonts w:ascii="Cairo" w:hAnsi="Cairo" w:cs="Cairo"/>
-          <w:color w:val="3A3A4A"/>
-          <w:sz w:val="22"/>
-          <w:szCs w:val="22"/>
-          <w:rtl/>
-        </w:rPr>
-        <w:t xml:space="preserve">مونتاج الفيديو وإضافة النصوص والعناوين.</w:t>
-      </w:r>
-    </w:p>
-    <w:p>
-      <w:pPr>
-        <w:bidi/>
-        <w:spacing w:before="18" w:after="18" w:line="252" w:lineRule="auto"/>
-        <w:ind w:start="360" w:hanging="280"/>
-        <w:contextualSpacing/>
-        <w:jc w:val="right"/>
-      </w:pPr>
-      <w:r>
-        <w:rPr>
-          <w:rFonts w:ascii="Cairo" w:hAnsi="Cairo" w:cs="Cairo"/>
-          <w:b/>
-          <w:bCs/>
-          <w:color w:val="F4612C"/>
-          <w:sz w:val="22"/>
-          <w:szCs w:val="22"/>
-          <w:rtl/>
-        </w:rPr>
-        <w:t xml:space="preserve">•  </w:t>
-      </w:r>
-      <w:r>
-        <w:rPr>
-          <w:rFonts w:ascii="Cairo" w:hAnsi="Cairo" w:cs="Cairo"/>
-          <w:color w:val="3A3A4A"/>
-          <w:sz w:val="22"/>
-          <w:szCs w:val="22"/>
-          <w:rtl/>
-        </w:rPr>
-        <w:t xml:space="preserve">إضافة المؤثرات الصوتية والموسيقى المناسبة.</w:t>
-      </w:r>
-    </w:p>
-    <w:p>
-      <w:pPr>
-        <w:bidi/>
-        <w:spacing w:before="18" w:after="18" w:line="252" w:lineRule="auto"/>
-        <w:ind w:start="360" w:hanging="280"/>
-        <w:contextualSpacing/>
-        <w:jc w:val="right"/>
-      </w:pPr>
-      <w:r>
-        <w:rPr>
-          <w:rFonts w:ascii="Cairo" w:hAnsi="Cairo" w:cs="Cairo"/>
-          <w:b/>
-          <w:bCs/>
-          <w:color w:val="F4612C"/>
-          <w:sz w:val="22"/>
-          <w:szCs w:val="22"/>
-          <w:rtl/>
-        </w:rPr>
-        <w:t xml:space="preserve">•  </w:t>
-      </w:r>
-      <w:r>
-        <w:rPr>
-          <w:rFonts w:ascii="Cairo" w:hAnsi="Cairo" w:cs="Cairo"/>
-          <w:color w:val="3A3A4A"/>
-          <w:sz w:val="22"/>
-          <w:szCs w:val="22"/>
-          <w:rtl/>
-        </w:rPr>
-        <w:t xml:space="preserve">إخراج نسخة مناسبة لإعلانات سناب شات وإنستغرام وتيك توك.</w:t>
-      </w:r>
-    </w:p>
-    <w:p>
-      <w:pPr>
-        <w:shd w:val="clear" w:color="auto" w:fill="4A1FA0"/>
-        <w:bidi/>
-        <w:spacing w:before="140" w:after="60" w:line="300" w:lineRule="auto"/>
-        <w:ind w:start="200" w:end="200"/>
-        <w:jc w:val="right"/>
-      </w:pPr>
-      <w:r>
-        <w:rPr>
-          <w:rFonts w:ascii="Cairo" w:hAnsi="Cairo" w:cs="Cairo"/>
-          <w:b/>
-          <w:bCs/>
-          <w:color w:val="FFFFFF"/>
-          <w:sz w:val="24"/>
-          <w:szCs w:val="24"/>
-          <w:rtl/>
-        </w:rPr>
-        <w:t xml:space="preserve">٣.  تصميم صفحة الهبوط (Landing Page)</w:t>
-      </w:r>
-    </w:p>
-    <w:p>
-      <w:pPr>
-        <w:bidi/>
-        <w:spacing w:before="18" w:after="18" w:line="252" w:lineRule="auto"/>
-        <w:ind w:start="360" w:hanging="280"/>
-        <w:contextualSpacing/>
-        <w:jc w:val="right"/>
-      </w:pPr>
-      <w:r>
-        <w:rPr>
-          <w:rFonts w:ascii="Cairo" w:hAnsi="Cairo" w:cs="Cairo"/>
-          <w:b/>
-          <w:bCs/>
-          <w:color w:val="F4612C"/>
-          <w:sz w:val="22"/>
-          <w:szCs w:val="22"/>
-          <w:rtl/>
-        </w:rPr>
-        <w:t xml:space="preserve">•  </w:t>
-      </w:r>
-      <w:r>
-        <w:rPr>
-          <w:rFonts w:ascii="Cairo" w:hAnsi="Cairo" w:cs="Cairo"/>
-          <w:color w:val="3A3A4A"/>
-          <w:sz w:val="22"/>
-          <w:szCs w:val="22"/>
-          <w:rtl/>
-        </w:rPr>
-        <w:t xml:space="preserve">تصميم صفحة مخصصة للحملة.</w:t>
-      </w:r>
-    </w:p>
-    <w:p>
-      <w:pPr>
-        <w:bidi/>
-        <w:spacing w:before="18" w:after="18" w:line="252" w:lineRule="auto"/>
-        <w:ind w:start="360" w:hanging="280"/>
-        <w:contextualSpacing/>
-        <w:jc w:val="right"/>
-      </w:pPr>
-      <w:r>
-        <w:rPr>
-          <w:rFonts w:ascii="Cairo" w:hAnsi="Cairo" w:cs="Cairo"/>
-          <w:b/>
-          <w:bCs/>
-          <w:color w:val="F4612C"/>
-          <w:sz w:val="22"/>
-          <w:szCs w:val="22"/>
-          <w:rtl/>
-        </w:rPr>
-        <w:t xml:space="preserve">•  </w:t>
-      </w:r>
-      <w:r>
-        <w:rPr>
-          <w:rFonts w:ascii="Cairo" w:hAnsi="Cairo" w:cs="Cairo"/>
-          <w:color w:val="3A3A4A"/>
-          <w:sz w:val="22"/>
-          <w:szCs w:val="22"/>
-          <w:rtl/>
-        </w:rPr>
-        <w:t xml:space="preserve">كتابة المحتوى التسويقي.</w:t>
-      </w:r>
-    </w:p>
-    <w:p>
-      <w:pPr>
-        <w:bidi/>
-        <w:spacing w:before="18" w:after="18" w:line="252" w:lineRule="auto"/>
-        <w:ind w:start="360" w:hanging="280"/>
-        <w:contextualSpacing/>
-        <w:jc w:val="right"/>
-      </w:pPr>
-      <w:r>
-        <w:rPr>
-          <w:rFonts w:ascii="Cairo" w:hAnsi="Cairo" w:cs="Cairo"/>
-          <w:b/>
-          <w:bCs/>
-          <w:color w:val="F4612C"/>
-          <w:sz w:val="22"/>
-          <w:szCs w:val="22"/>
-          <w:rtl/>
-        </w:rPr>
-        <w:t xml:space="preserve">•  </w:t>
-      </w:r>
-      <w:r>
-        <w:rPr>
-          <w:rFonts w:ascii="Cairo" w:hAnsi="Cairo" w:cs="Cairo"/>
-          <w:color w:val="3A3A4A"/>
-          <w:sz w:val="22"/>
-          <w:szCs w:val="22"/>
-          <w:rtl/>
-        </w:rPr>
-        <w:t xml:space="preserve">إضافة الفيديو الإعلاني وعرض مميزات المدرسة.</w:t>
-      </w:r>
-    </w:p>
-    <w:p>
-      <w:pPr>
-        <w:bidi/>
-        <w:spacing w:before="18" w:after="18" w:line="252" w:lineRule="auto"/>
-        <w:ind w:start="360" w:hanging="280"/>
-        <w:contextualSpacing/>
-        <w:jc w:val="right"/>
-      </w:pPr>
-      <w:r>
-        <w:rPr>
-          <w:rFonts w:ascii="Cairo" w:hAnsi="Cairo" w:cs="Cairo"/>
-          <w:b/>
-          <w:bCs/>
-          <w:color w:val="F4612C"/>
-          <w:sz w:val="22"/>
-          <w:szCs w:val="22"/>
-          <w:rtl/>
-        </w:rPr>
-        <w:t xml:space="preserve">•  </w:t>
-      </w:r>
-      <w:r>
-        <w:rPr>
-          <w:rFonts w:ascii="Cairo" w:hAnsi="Cairo" w:cs="Cairo"/>
-          <w:color w:val="3A3A4A"/>
-          <w:sz w:val="22"/>
-          <w:szCs w:val="22"/>
-          <w:rtl/>
-        </w:rPr>
-        <w:t xml:space="preserve">زر "سجّل الآن" واضح ومباشر.</w:t>
-      </w:r>
-    </w:p>
-    <w:p>
-      <w:pPr>
-        <w:bidi/>
-        <w:spacing w:before="18" w:after="18" w:line="252" w:lineRule="auto"/>
-        <w:ind w:start="360" w:hanging="280"/>
-        <w:contextualSpacing/>
-        <w:jc w:val="right"/>
-      </w:pPr>
-      <w:r>
-        <w:rPr>
-          <w:rFonts w:ascii="Cairo" w:hAnsi="Cairo" w:cs="Cairo"/>
-          <w:b/>
-          <w:bCs/>
-          <w:color w:val="F4612C"/>
-          <w:sz w:val="22"/>
-          <w:szCs w:val="22"/>
-          <w:rtl/>
-        </w:rPr>
-        <w:t xml:space="preserve">•  </w:t>
-      </w:r>
-      <w:r>
-        <w:rPr>
-          <w:rFonts w:ascii="Cairo" w:hAnsi="Cairo" w:cs="Cairo"/>
-          <w:color w:val="3A3A4A"/>
-          <w:sz w:val="22"/>
-          <w:szCs w:val="22"/>
-          <w:rtl/>
-        </w:rPr>
-        <w:t xml:space="preserve">تصميم متوافق مع الجوال.</w:t>
-      </w:r>
-    </w:p>
-    <w:p>
-      <w:pPr>
-        <w:shd w:val="clear" w:color="auto" w:fill="4A1FA0"/>
-        <w:bidi/>
-        <w:spacing w:before="140" w:after="60" w:line="300" w:lineRule="auto"/>
-        <w:ind w:start="200" w:end="200"/>
-        <w:jc w:val="right"/>
-      </w:pPr>
-      <w:r>
-        <w:rPr>
-          <w:rFonts w:ascii="Cairo" w:hAnsi="Cairo" w:cs="Cairo"/>
-          <w:b/>
-          <w:bCs/>
-          <w:color w:val="FFFFFF"/>
-          <w:sz w:val="24"/>
-          <w:szCs w:val="24"/>
-          <w:rtl/>
-        </w:rPr>
-        <w:t xml:space="preserve">٤.  إنشاء نموذج التسجيل</w:t>
-      </w:r>
-    </w:p>
-    <w:p>
-      <w:pPr>
-        <w:bidi/>
-        <w:spacing w:before="18" w:after="18" w:line="252" w:lineRule="auto"/>
-        <w:ind w:start="360" w:hanging="280"/>
-        <w:contextualSpacing/>
-        <w:jc w:val="right"/>
-      </w:pPr>
-      <w:r>
-        <w:rPr>
-          <w:rFonts w:ascii="Cairo" w:hAnsi="Cairo" w:cs="Cairo"/>
-          <w:b/>
-          <w:bCs/>
-          <w:color w:val="F4612C"/>
-          <w:sz w:val="22"/>
-          <w:szCs w:val="22"/>
-          <w:rtl/>
-        </w:rPr>
-        <w:t xml:space="preserve">•  </w:t>
-      </w:r>
-      <w:r>
-        <w:rPr>
-          <w:rFonts w:ascii="Cairo" w:hAnsi="Cairo" w:cs="Cairo"/>
-          <w:color w:val="3A3A4A"/>
-          <w:sz w:val="22"/>
-          <w:szCs w:val="22"/>
-          <w:rtl/>
-        </w:rPr>
-        <w:t xml:space="preserve">اسم ولي الأمر.</w:t>
-      </w:r>
-    </w:p>
-    <w:p>
-      <w:pPr>
-        <w:bidi/>
-        <w:spacing w:before="18" w:after="18" w:line="252" w:lineRule="auto"/>
-        <w:ind w:start="360" w:hanging="280"/>
-        <w:contextualSpacing/>
-        <w:jc w:val="right"/>
-      </w:pPr>
-      <w:r>
-        <w:rPr>
-          <w:rFonts w:ascii="Cairo" w:hAnsi="Cairo" w:cs="Cairo"/>
-          <w:b/>
-          <w:bCs/>
-          <w:color w:val="F4612C"/>
-          <w:sz w:val="22"/>
-          <w:szCs w:val="22"/>
-          <w:rtl/>
-        </w:rPr>
-        <w:t xml:space="preserve">•  </w:t>
-      </w:r>
-      <w:r>
-        <w:rPr>
-          <w:rFonts w:ascii="Cairo" w:hAnsi="Cairo" w:cs="Cairo"/>
-          <w:color w:val="3A3A4A"/>
-          <w:sz w:val="22"/>
-          <w:szCs w:val="22"/>
-          <w:rtl/>
-        </w:rPr>
-        <w:t xml:space="preserve">اختيار (الأب / الأم).</w:t>
-      </w:r>
-    </w:p>
-    <w:p>
-      <w:pPr>
-        <w:bidi/>
-        <w:spacing w:before="18" w:after="18" w:line="252" w:lineRule="auto"/>
-        <w:ind w:start="360" w:hanging="280"/>
-        <w:contextualSpacing/>
-        <w:jc w:val="right"/>
-      </w:pPr>
-      <w:r>
-        <w:rPr>
-          <w:rFonts w:ascii="Cairo" w:hAnsi="Cairo" w:cs="Cairo"/>
-          <w:b/>
-          <w:bCs/>
-          <w:color w:val="F4612C"/>
-          <w:sz w:val="22"/>
-          <w:szCs w:val="22"/>
-          <w:rtl/>
-        </w:rPr>
-        <w:t xml:space="preserve">•  </w:t>
-      </w:r>
-      <w:r>
-        <w:rPr>
-          <w:rFonts w:ascii="Cairo" w:hAnsi="Cairo" w:cs="Cairo"/>
-          <w:color w:val="3A3A4A"/>
-          <w:sz w:val="22"/>
-          <w:szCs w:val="22"/>
-          <w:rtl/>
-        </w:rPr>
-        <w:t xml:space="preserve">رقم الجوال.</w:t>
-      </w:r>
-    </w:p>
-    <w:p>
-      <w:pPr>
-        <w:bidi/>
-        <w:spacing w:before="18" w:after="18" w:line="252" w:lineRule="auto"/>
-        <w:ind w:start="360" w:hanging="280"/>
-        <w:contextualSpacing/>
-        <w:jc w:val="right"/>
-      </w:pPr>
-      <w:r>
-        <w:rPr>
-          <w:rFonts w:ascii="Cairo" w:hAnsi="Cairo" w:cs="Cairo"/>
-          <w:b/>
-          <w:bCs/>
-          <w:color w:val="F4612C"/>
-          <w:sz w:val="22"/>
-          <w:szCs w:val="22"/>
-          <w:rtl/>
-        </w:rPr>
-        <w:t xml:space="preserve">•  </w:t>
-      </w:r>
-      <w:r>
-        <w:rPr>
-          <w:rFonts w:ascii="Cairo" w:hAnsi="Cairo" w:cs="Cairo"/>
-          <w:color w:val="3A3A4A"/>
-          <w:sz w:val="22"/>
-          <w:szCs w:val="22"/>
-          <w:rtl/>
-        </w:rPr>
-        <w:t xml:space="preserve">المرحلة الدراسية والصف الدراسي.</w:t>
-      </w:r>
-    </w:p>
-    <w:p>
-      <w:pPr>
-        <w:bidi/>
-        <w:spacing w:before="18" w:after="18" w:line="252" w:lineRule="auto"/>
-        <w:ind w:start="360" w:hanging="280"/>
-        <w:contextualSpacing/>
-        <w:jc w:val="right"/>
-      </w:pPr>
-      <w:r>
-        <w:rPr>
-          <w:rFonts w:ascii="Cairo" w:hAnsi="Cairo" w:cs="Cairo"/>
-          <w:b/>
-          <w:bCs/>
-          <w:color w:val="F4612C"/>
-          <w:sz w:val="22"/>
-          <w:szCs w:val="22"/>
-          <w:rtl/>
-        </w:rPr>
-        <w:t xml:space="preserve">•  </w:t>
-      </w:r>
-      <w:r>
-        <w:rPr>
-          <w:rFonts w:ascii="Cairo" w:hAnsi="Cairo" w:cs="Cairo"/>
-          <w:color w:val="3A3A4A"/>
-          <w:sz w:val="22"/>
-          <w:szCs w:val="22"/>
-          <w:rtl/>
-        </w:rPr>
-        <w:t xml:space="preserve">إرسال البيانات مباشرةً لإدارة المدرسة.</w:t>
-      </w:r>
-    </w:p>
-    <w:p>
-      <w:pPr>
-        <w:shd w:val="clear" w:color="auto" w:fill="4A1FA0"/>
-        <w:bidi/>
-        <w:spacing w:before="140" w:after="60" w:line="300" w:lineRule="auto"/>
-        <w:ind w:start="200" w:end="200"/>
-        <w:jc w:val="right"/>
-      </w:pPr>
-      <w:r>
-        <w:rPr>
-          <w:rFonts w:ascii="Cairo" w:hAnsi="Cairo" w:cs="Cairo"/>
-          <w:b/>
-          <w:bCs/>
-          <w:color w:val="FFFFFF"/>
-          <w:sz w:val="24"/>
-          <w:szCs w:val="24"/>
-          <w:rtl/>
-        </w:rPr>
-        <w:t xml:space="preserve">٥.  إعداد الحملات الإعلانية</w:t>
-      </w:r>
-    </w:p>
-    <w:p>
-      <w:pPr>
-        <w:bidi/>
-        <w:spacing w:before="18" w:after="18" w:line="252" w:lineRule="auto"/>
-        <w:ind w:start="360" w:hanging="280"/>
-        <w:contextualSpacing/>
-        <w:jc w:val="right"/>
-      </w:pPr>
-      <w:r>
-        <w:rPr>
-          <w:rFonts w:ascii="Cairo" w:hAnsi="Cairo" w:cs="Cairo"/>
-          <w:b/>
-          <w:bCs/>
-          <w:color w:val="F4612C"/>
-          <w:sz w:val="22"/>
-          <w:szCs w:val="22"/>
-          <w:rtl/>
-        </w:rPr>
-        <w:t xml:space="preserve">•  </w:t>
-      </w:r>
-      <w:r>
-        <w:rPr>
-          <w:rFonts w:ascii="Cairo" w:hAnsi="Cairo" w:cs="Cairo"/>
-          <w:color w:val="3A3A4A"/>
-          <w:sz w:val="22"/>
-          <w:szCs w:val="22"/>
-          <w:rtl/>
-        </w:rPr>
-        <w:t xml:space="preserve">إنشاء الحملات الإعلانية وإعداد الجمهور المستهدف.</w:t>
-      </w:r>
-    </w:p>
-    <w:p>
-      <w:pPr>
-        <w:bidi/>
-        <w:spacing w:before="18" w:after="18" w:line="252" w:lineRule="auto"/>
-        <w:ind w:start="360" w:hanging="280"/>
-        <w:contextualSpacing/>
-        <w:jc w:val="right"/>
-      </w:pPr>
-      <w:r>
-        <w:rPr>
-          <w:rFonts w:ascii="Cairo" w:hAnsi="Cairo" w:cs="Cairo"/>
-          <w:b/>
-          <w:bCs/>
-          <w:color w:val="F4612C"/>
-          <w:sz w:val="22"/>
-          <w:szCs w:val="22"/>
-          <w:rtl/>
-        </w:rPr>
-        <w:t xml:space="preserve">•  </w:t>
-      </w:r>
-      <w:r>
-        <w:rPr>
-          <w:rFonts w:ascii="Cairo" w:hAnsi="Cairo" w:cs="Cairo"/>
-          <w:color w:val="3A3A4A"/>
-          <w:sz w:val="22"/>
-          <w:szCs w:val="22"/>
-          <w:rtl/>
-        </w:rPr>
-        <w:t xml:space="preserve">تحديد المناطق الجغرافية.</w:t>
-      </w:r>
-    </w:p>
-    <w:p>
-      <w:pPr>
-        <w:bidi/>
-        <w:spacing w:before="18" w:after="18" w:line="252" w:lineRule="auto"/>
-        <w:ind w:start="360" w:hanging="280"/>
-        <w:contextualSpacing/>
-        <w:jc w:val="right"/>
-      </w:pPr>
-      <w:r>
-        <w:rPr>
-          <w:rFonts w:ascii="Cairo" w:hAnsi="Cairo" w:cs="Cairo"/>
-          <w:b/>
-          <w:bCs/>
-          <w:color w:val="F4612C"/>
-          <w:sz w:val="22"/>
-          <w:szCs w:val="22"/>
-          <w:rtl/>
-        </w:rPr>
-        <w:t xml:space="preserve">•  </w:t>
-      </w:r>
-      <w:r>
-        <w:rPr>
-          <w:rFonts w:ascii="Cairo" w:hAnsi="Cairo" w:cs="Cairo"/>
-          <w:color w:val="3A3A4A"/>
-          <w:sz w:val="22"/>
-          <w:szCs w:val="22"/>
-          <w:rtl/>
-        </w:rPr>
-        <w:t xml:space="preserve">إعداد أهداف الحملة.</w:t>
-      </w:r>
-    </w:p>
-    <w:p>
-      <w:pPr>
-        <w:bidi/>
-        <w:spacing w:before="18" w:after="18" w:line="252" w:lineRule="auto"/>
-        <w:ind w:start="360" w:hanging="280"/>
-        <w:contextualSpacing/>
-        <w:jc w:val="right"/>
-      </w:pPr>
-      <w:r>
-        <w:rPr>
-          <w:rFonts w:ascii="Cairo" w:hAnsi="Cairo" w:cs="Cairo"/>
-          <w:b/>
-          <w:bCs/>
-          <w:color w:val="F4612C"/>
-          <w:sz w:val="22"/>
-          <w:szCs w:val="22"/>
-          <w:rtl/>
-        </w:rPr>
-        <w:t xml:space="preserve">•  </w:t>
-      </w:r>
-      <w:r>
-        <w:rPr>
-          <w:rFonts w:ascii="Cairo" w:hAnsi="Cairo" w:cs="Cairo"/>
-          <w:color w:val="3A3A4A"/>
-          <w:sz w:val="22"/>
-          <w:szCs w:val="22"/>
-          <w:rtl/>
-        </w:rPr>
-        <w:t xml:space="preserve">تركيب Pixel وأدوات التتبّع.</w:t>
-      </w:r>
-    </w:p>
-    <w:p>
-      <w:pPr>
-        <w:bidi/>
-        <w:spacing w:before="18" w:after="18" w:line="252" w:lineRule="auto"/>
-        <w:ind w:start="360" w:hanging="280"/>
-        <w:contextualSpacing/>
-        <w:jc w:val="right"/>
-      </w:pPr>
-      <w:r>
-        <w:rPr>
-          <w:rFonts w:ascii="Cairo" w:hAnsi="Cairo" w:cs="Cairo"/>
-          <w:b/>
-          <w:bCs/>
-          <w:color w:val="F4612C"/>
-          <w:sz w:val="22"/>
-          <w:szCs w:val="22"/>
-          <w:rtl/>
-        </w:rPr>
-        <w:t xml:space="preserve">•  </w:t>
-      </w:r>
-      <w:r>
-        <w:rPr>
-          <w:rFonts w:ascii="Cairo" w:hAnsi="Cairo" w:cs="Cairo"/>
-          <w:color w:val="3A3A4A"/>
-          <w:sz w:val="22"/>
-          <w:szCs w:val="22"/>
-          <w:rtl/>
-        </w:rPr>
-        <w:t xml:space="preserve">ربط صفحة الهبوط بالحملات.</w:t>
-      </w:r>
-    </w:p>
-    <w:p>
-      <w:pPr>
-        <w:shd w:val="clear" w:color="auto" w:fill="4A1FA0"/>
-        <w:bidi/>
-        <w:spacing w:before="140" w:after="60" w:line="300" w:lineRule="auto"/>
-        <w:ind w:start="200" w:end="200"/>
-        <w:jc w:val="right"/>
-      </w:pPr>
-      <w:r>
-        <w:rPr>
-          <w:rFonts w:ascii="Cairo" w:hAnsi="Cairo" w:cs="Cairo"/>
-          <w:b/>
-          <w:bCs/>
-          <w:color w:val="FFFFFF"/>
-          <w:sz w:val="24"/>
-          <w:szCs w:val="24"/>
-          <w:rtl/>
-        </w:rPr>
-        <w:t xml:space="preserve">٦.  إدارة وتحسين الحملة</w:t>
-      </w:r>
-    </w:p>
-    <w:p>
-      <w:pPr>
-        <w:bidi/>
-        <w:spacing w:before="18" w:after="18" w:line="252" w:lineRule="auto"/>
-        <w:ind w:start="360" w:hanging="280"/>
-        <w:contextualSpacing/>
-        <w:jc w:val="right"/>
-      </w:pPr>
-      <w:r>
-        <w:rPr>
-          <w:rFonts w:ascii="Cairo" w:hAnsi="Cairo" w:cs="Cairo"/>
-          <w:b/>
-          <w:bCs/>
-          <w:color w:val="F4612C"/>
-          <w:sz w:val="22"/>
-          <w:szCs w:val="22"/>
-          <w:rtl/>
-        </w:rPr>
-        <w:t xml:space="preserve">•  </w:t>
-      </w:r>
-      <w:r>
-        <w:rPr>
-          <w:rFonts w:ascii="Cairo" w:hAnsi="Cairo" w:cs="Cairo"/>
-          <w:color w:val="3A3A4A"/>
-          <w:sz w:val="22"/>
-          <w:szCs w:val="22"/>
-          <w:rtl/>
-        </w:rPr>
-        <w:t xml:space="preserve">متابعة الأداء وتحسين الإعلانات.</w:t>
-      </w:r>
-    </w:p>
-    <w:p>
-      <w:pPr>
-        <w:bidi/>
-        <w:spacing w:before="18" w:after="18" w:line="252" w:lineRule="auto"/>
-        <w:ind w:start="360" w:hanging="280"/>
-        <w:contextualSpacing/>
-        <w:jc w:val="right"/>
-      </w:pPr>
-      <w:r>
-        <w:rPr>
-          <w:rFonts w:ascii="Cairo" w:hAnsi="Cairo" w:cs="Cairo"/>
-          <w:b/>
-          <w:bCs/>
-          <w:color w:val="F4612C"/>
-          <w:sz w:val="22"/>
-          <w:szCs w:val="22"/>
-          <w:rtl/>
-        </w:rPr>
-        <w:t xml:space="preserve">•  </w:t>
-      </w:r>
-      <w:r>
-        <w:rPr>
-          <w:rFonts w:ascii="Cairo" w:hAnsi="Cairo" w:cs="Cairo"/>
-          <w:color w:val="3A3A4A"/>
-          <w:sz w:val="22"/>
-          <w:szCs w:val="22"/>
-          <w:rtl/>
-        </w:rPr>
-        <w:t xml:space="preserve">اختبار أكثر من إعلان.</w:t>
-      </w:r>
-    </w:p>
-    <w:p>
-      <w:pPr>
-        <w:bidi/>
-        <w:spacing w:before="18" w:after="18" w:line="252" w:lineRule="auto"/>
-        <w:ind w:start="360" w:hanging="280"/>
-        <w:contextualSpacing/>
-        <w:jc w:val="right"/>
-      </w:pPr>
-      <w:r>
-        <w:rPr>
-          <w:rFonts w:ascii="Cairo" w:hAnsi="Cairo" w:cs="Cairo"/>
-          <w:b/>
-          <w:bCs/>
-          <w:color w:val="F4612C"/>
-          <w:sz w:val="22"/>
-          <w:szCs w:val="22"/>
-          <w:rtl/>
-        </w:rPr>
-        <w:t xml:space="preserve">•  </w:t>
-      </w:r>
-      <w:r>
-        <w:rPr>
-          <w:rFonts w:ascii="Cairo" w:hAnsi="Cairo" w:cs="Cairo"/>
-          <w:color w:val="3A3A4A"/>
-          <w:sz w:val="22"/>
-          <w:szCs w:val="22"/>
-          <w:rtl/>
-        </w:rPr>
-        <w:t xml:space="preserve">متابعة تكلفة الحصول على العميل.</w:t>
-      </w:r>
-    </w:p>
-    <w:p>
-      <w:pPr>
-        <w:bidi/>
-        <w:spacing w:before="18" w:after="18" w:line="252" w:lineRule="auto"/>
-        <w:ind w:start="360" w:hanging="280"/>
-        <w:contextualSpacing/>
-        <w:jc w:val="right"/>
-      </w:pPr>
-      <w:r>
-        <w:rPr>
-          <w:rFonts w:ascii="Cairo" w:hAnsi="Cairo" w:cs="Cairo"/>
-          <w:b/>
-          <w:bCs/>
-          <w:color w:val="F4612C"/>
-          <w:sz w:val="22"/>
-          <w:szCs w:val="22"/>
-          <w:rtl/>
-        </w:rPr>
-        <w:t xml:space="preserve">•  </w:t>
-      </w:r>
-      <w:r>
-        <w:rPr>
-          <w:rFonts w:ascii="Cairo" w:hAnsi="Cairo" w:cs="Cairo"/>
-          <w:color w:val="3A3A4A"/>
-          <w:sz w:val="22"/>
-          <w:szCs w:val="22"/>
-          <w:rtl/>
-        </w:rPr>
-        <w:t xml:space="preserve">رفع كفاءة النتائج.</w:t>
-      </w:r>
-    </w:p>
-    <w:p>
-      <w:pPr>
-        <w:shd w:val="clear" w:color="auto" w:fill="4A1FA0"/>
-        <w:bidi/>
-        <w:spacing w:before="140" w:after="60" w:line="300" w:lineRule="auto"/>
-        <w:ind w:start="200" w:end="200"/>
-        <w:jc w:val="right"/>
-      </w:pPr>
-      <w:r>
-        <w:rPr>
-          <w:rFonts w:ascii="Cairo" w:hAnsi="Cairo" w:cs="Cairo"/>
-          <w:b/>
-          <w:bCs/>
-          <w:color w:val="FFFFFF"/>
-          <w:sz w:val="24"/>
-          <w:szCs w:val="24"/>
-          <w:rtl/>
-        </w:rPr>
-        <w:t xml:space="preserve">٧.  التقرير النهائي</w:t>
-      </w:r>
-    </w:p>
-    <w:p>
-      <w:pPr>
-        <w:bidi/>
-        <w:spacing w:before="18" w:after="18" w:line="252" w:lineRule="auto"/>
-        <w:ind w:start="360" w:hanging="280"/>
-        <w:contextualSpacing/>
-        <w:jc w:val="right"/>
-      </w:pPr>
-      <w:r>
-        <w:rPr>
-          <w:rFonts w:ascii="Cairo" w:hAnsi="Cairo" w:cs="Cairo"/>
-          <w:b/>
-          <w:bCs/>
-          <w:color w:val="F4612C"/>
-          <w:sz w:val="22"/>
-          <w:szCs w:val="22"/>
-          <w:rtl/>
-        </w:rPr>
-        <w:t xml:space="preserve">•  </w:t>
-      </w:r>
-      <w:r>
-        <w:rPr>
-          <w:rFonts w:ascii="Cairo" w:hAnsi="Cairo" w:cs="Cairo"/>
-          <w:color w:val="3A3A4A"/>
-          <w:sz w:val="22"/>
-          <w:szCs w:val="22"/>
-          <w:rtl/>
-        </w:rPr>
-        <w:t xml:space="preserve">عدد الطلبات ونتائج الحملة.</w:t>
-      </w:r>
-    </w:p>
-    <w:p>
-      <w:pPr>
-        <w:bidi/>
-        <w:spacing w:before="18" w:after="18" w:line="252" w:lineRule="auto"/>
-        <w:ind w:start="360" w:hanging="280"/>
-        <w:contextualSpacing/>
-        <w:jc w:val="right"/>
-      </w:pPr>
-      <w:r>
-        <w:rPr>
-          <w:rFonts w:ascii="Cairo" w:hAnsi="Cairo" w:cs="Cairo"/>
-          <w:b/>
-          <w:bCs/>
-          <w:color w:val="F4612C"/>
-          <w:sz w:val="22"/>
-          <w:szCs w:val="22"/>
-          <w:rtl/>
-        </w:rPr>
-        <w:t xml:space="preserve">•  </w:t>
-      </w:r>
-      <w:r>
-        <w:rPr>
-          <w:rFonts w:ascii="Cairo" w:hAnsi="Cairo" w:cs="Cairo"/>
-          <w:color w:val="3A3A4A"/>
-          <w:sz w:val="22"/>
-          <w:szCs w:val="22"/>
-          <w:rtl/>
-        </w:rPr>
-        <w:t xml:space="preserve">أداء الإعلانات.</w:t>
-      </w:r>
-    </w:p>
-    <w:p>
-      <w:pPr>
-        <w:bidi/>
-        <w:spacing w:before="18" w:after="18" w:line="252" w:lineRule="auto"/>
-        <w:ind w:start="360" w:hanging="280"/>
-        <w:contextualSpacing/>
-        <w:jc w:val="right"/>
-      </w:pPr>
-      <w:r>
-        <w:rPr>
-          <w:rFonts w:ascii="Cairo" w:hAnsi="Cairo" w:cs="Cairo"/>
-          <w:b/>
-          <w:bCs/>
-          <w:color w:val="F4612C"/>
-          <w:sz w:val="22"/>
-          <w:szCs w:val="22"/>
-          <w:rtl/>
-        </w:rPr>
-        <w:t xml:space="preserve">•  </w:t>
-      </w:r>
-      <w:r>
-        <w:rPr>
-          <w:rFonts w:ascii="Cairo" w:hAnsi="Cairo" w:cs="Cairo"/>
-          <w:color w:val="3A3A4A"/>
-          <w:sz w:val="22"/>
-          <w:szCs w:val="22"/>
-          <w:rtl/>
-        </w:rPr>
-        <w:t xml:space="preserve">التوصيات المستقبلية.</w:t>
+        <w:t xml:space="preserve">2,300 ريال (شاملة الضريبة)</w:t>
       </w:r>
     </w:p>
     <w:p>
@@ -1422,60 +631,50 @@
         <w:t xml:space="preserve">ثانياً: العرض المالي</w:t>
       </w:r>
     </w:p>
-    <w:p>
-      <w:pPr>
-        <w:bidi/>
-        <w:spacing w:before="30" w:after="100" w:line="280" w:lineRule="auto"/>
-        <w:jc w:val="center"/>
-      </w:pPr>
-      <w:r>
-        <w:rPr>
-          <w:rFonts w:ascii="Cairo" w:hAnsi="Cairo" w:cs="Cairo"/>
-          <w:b/>
-          <w:bCs/>
-          <w:color w:val="4A1FA0"/>
-          <w:sz w:val="20"/>
-          <w:szCs w:val="20"/>
-          <w:rtl/>
-        </w:rPr>
-        <w:t xml:space="preserve">نموذج شراكة: رسوم ثابتة منخفضة + عمولة عند تحقيق التسجيلات — نجاحنا مرتبط بنجاحكم.</w:t>
-      </w:r>
-    </w:p>
     <w:tbl>
       <w:tblPr>
         <w:bidiVisual/>
-        <w:tblW w:w="9640" w:type="dxa"/>
+        <w:tblW w:w="9746" w:type="dxa"/>
         <w:jc w:val="center"/>
+        <w:tblBorders>
+          <w:top w:val="single" w:sz="4" w:space="0" w:color="D8D0EC"/>
+          <w:left w:val="single" w:sz="4" w:space="0" w:color="D8D0EC"/>
+          <w:bottom w:val="single" w:sz="4" w:space="0" w:color="D8D0EC"/>
+          <w:right w:val="single" w:sz="4" w:space="0" w:color="D8D0EC"/>
+          <w:insideH w:val="single" w:sz="4" w:space="0" w:color="D8D0EC"/>
+          <w:insideV w:val="single" w:sz="4" w:space="0" w:color="D8D0EC"/>
+        </w:tblBorders>
         <w:tblLook w:val="0000" w:firstRow="0" w:lastRow="0" w:firstColumn="0" w:lastColumn="0" w:noHBand="1" w:noVBand="1"/>
       </w:tblPr>
       <w:tblGrid>
-        <w:gridCol w:w="4560"/>
-        <w:gridCol w:w="520"/>
-        <w:gridCol w:w="4560"/>
+        <w:gridCol w:w="2746"/>
+        <w:gridCol w:w="2200"/>
+        <w:gridCol w:w="2400"/>
+        <w:gridCol w:w="2400"/>
       </w:tblGrid>
       <w:tr>
         <w:tc>
           <w:tcPr>
-            <w:tcW w:w="4560" w:type="dxa"/>
+            <w:tcW w:w="2746" w:type="dxa"/>
             <w:tcBorders>
-              <w:top w:val="single" w:sz="14" w:space="0" w:color="F4612C"/>
-              <w:left w:val="single" w:sz="14" w:space="0" w:color="F4612C"/>
-              <w:bottom w:val="single" w:sz="14" w:space="0" w:color="F4612C"/>
-              <w:right w:val="single" w:sz="14" w:space="0" w:color="F4612C"/>
+              <w:top w:val="single" w:sz="4" w:space="0" w:color="D8D0EC"/>
+              <w:left w:val="single" w:sz="4" w:space="0" w:color="D8D0EC"/>
+              <w:bottom w:val="single" w:sz="4" w:space="0" w:color="D8D0EC"/>
+              <w:right w:val="single" w:sz="4" w:space="0" w:color="D8D0EC"/>
             </w:tcBorders>
-            <w:shd w:val="clear" w:color="auto" w:fill="FFF4E0"/>
+            <w:shd w:val="clear" w:color="auto" w:fill="4A1FA0"/>
             <w:tcMar>
-              <w:top w:w="140" w:type="dxa"/>
-              <w:left w:w="120" w:type="dxa"/>
-              <w:bottom w:w="140" w:type="dxa"/>
-              <w:right w:w="120" w:type="dxa"/>
+              <w:top w:w="40" w:type="dxa"/>
+              <w:left w:w="90" w:type="dxa"/>
+              <w:bottom w:w="40" w:type="dxa"/>
+              <w:right w:w="90" w:type="dxa"/>
             </w:tcMar>
             <w:vAlign w:val="center"/>
           </w:tcPr>
           <w:p>
             <w:pPr>
               <w:bidi/>
-              <w:spacing w:before="20" w:after="20" w:line="300" w:lineRule="auto"/>
+              <w:spacing w:before="26" w:after="26" w:line="252" w:lineRule="auto"/>
               <w:jc w:val="center"/>
             </w:pPr>
             <w:r>
@@ -1483,18 +682,263 @@
                 <w:rFonts w:ascii="Cairo" w:hAnsi="Cairo" w:cs="Cairo"/>
                 <w:b/>
                 <w:bCs/>
-                <w:color w:val="4A1FA0"/>
-                <w:sz w:val="22"/>
-                <w:szCs w:val="22"/>
+                <w:color w:val="FFFFFF"/>
+                <w:sz w:val="21"/>
+                <w:szCs w:val="21"/>
                 <w:rtl/>
               </w:rPr>
-              <w:t xml:space="preserve">الرسوم الثابتة</w:t>
+              <w:t xml:space="preserve">المرحلة</w:t>
             </w:r>
           </w:p>
+        </w:tc>
+        <w:tc>
+          <w:tcPr>
+            <w:tcW w:w="2200" w:type="dxa"/>
+            <w:tcBorders>
+              <w:top w:val="single" w:sz="4" w:space="0" w:color="D8D0EC"/>
+              <w:left w:val="single" w:sz="4" w:space="0" w:color="D8D0EC"/>
+              <w:bottom w:val="single" w:sz="4" w:space="0" w:color="D8D0EC"/>
+              <w:right w:val="single" w:sz="4" w:space="0" w:color="D8D0EC"/>
+            </w:tcBorders>
+            <w:shd w:val="clear" w:color="auto" w:fill="4A1FA0"/>
+            <w:tcMar>
+              <w:top w:w="40" w:type="dxa"/>
+              <w:left w:w="90" w:type="dxa"/>
+              <w:bottom w:w="40" w:type="dxa"/>
+              <w:right w:w="90" w:type="dxa"/>
+            </w:tcMar>
+            <w:vAlign w:val="center"/>
+          </w:tcPr>
           <w:p>
             <w:pPr>
               <w:bidi/>
-              <w:spacing w:before="0" w:after="20" w:line="560" w:lineRule="auto"/>
+              <w:spacing w:before="26" w:after="26" w:line="252" w:lineRule="auto"/>
+              <w:jc w:val="center"/>
+            </w:pPr>
+            <w:r>
+              <w:rPr>
+                <w:rFonts w:ascii="Cairo" w:hAnsi="Cairo" w:cs="Cairo"/>
+                <w:b/>
+                <w:bCs/>
+                <w:color w:val="FFFFFF"/>
+                <w:sz w:val="21"/>
+                <w:szCs w:val="21"/>
+                <w:rtl/>
+              </w:rPr>
+              <w:t xml:space="preserve">المبلغ</w:t>
+            </w:r>
+          </w:p>
+        </w:tc>
+        <w:tc>
+          <w:tcPr>
+            <w:tcW w:w="2400" w:type="dxa"/>
+            <w:tcBorders>
+              <w:top w:val="single" w:sz="4" w:space="0" w:color="D8D0EC"/>
+              <w:left w:val="single" w:sz="4" w:space="0" w:color="D8D0EC"/>
+              <w:bottom w:val="single" w:sz="4" w:space="0" w:color="D8D0EC"/>
+              <w:right w:val="single" w:sz="4" w:space="0" w:color="D8D0EC"/>
+            </w:tcBorders>
+            <w:shd w:val="clear" w:color="auto" w:fill="4A1FA0"/>
+            <w:tcMar>
+              <w:top w:w="40" w:type="dxa"/>
+              <w:left w:w="90" w:type="dxa"/>
+              <w:bottom w:w="40" w:type="dxa"/>
+              <w:right w:w="90" w:type="dxa"/>
+            </w:tcMar>
+            <w:vAlign w:val="center"/>
+          </w:tcPr>
+          <w:p>
+            <w:pPr>
+              <w:bidi/>
+              <w:spacing w:before="26" w:after="26" w:line="252" w:lineRule="auto"/>
+              <w:jc w:val="center"/>
+            </w:pPr>
+            <w:r>
+              <w:rPr>
+                <w:rFonts w:ascii="Cairo" w:hAnsi="Cairo" w:cs="Cairo"/>
+                <w:b/>
+                <w:bCs/>
+                <w:color w:val="FFFFFF"/>
+                <w:sz w:val="21"/>
+                <w:szCs w:val="21"/>
+                <w:rtl/>
+              </w:rPr>
+              <w:t xml:space="preserve">الضريبة 15%</w:t>
+            </w:r>
+          </w:p>
+        </w:tc>
+        <w:tc>
+          <w:tcPr>
+            <w:tcW w:w="2400" w:type="dxa"/>
+            <w:tcBorders>
+              <w:top w:val="single" w:sz="4" w:space="0" w:color="D8D0EC"/>
+              <w:left w:val="single" w:sz="4" w:space="0" w:color="D8D0EC"/>
+              <w:bottom w:val="single" w:sz="4" w:space="0" w:color="D8D0EC"/>
+              <w:right w:val="single" w:sz="4" w:space="0" w:color="D8D0EC"/>
+            </w:tcBorders>
+            <w:shd w:val="clear" w:color="auto" w:fill="4A1FA0"/>
+            <w:tcMar>
+              <w:top w:w="40" w:type="dxa"/>
+              <w:left w:w="90" w:type="dxa"/>
+              <w:bottom w:w="40" w:type="dxa"/>
+              <w:right w:w="90" w:type="dxa"/>
+            </w:tcMar>
+            <w:vAlign w:val="center"/>
+          </w:tcPr>
+          <w:p>
+            <w:pPr>
+              <w:bidi/>
+              <w:spacing w:before="26" w:after="26" w:line="252" w:lineRule="auto"/>
+              <w:jc w:val="center"/>
+            </w:pPr>
+            <w:r>
+              <w:rPr>
+                <w:rFonts w:ascii="Cairo" w:hAnsi="Cairo" w:cs="Cairo"/>
+                <w:b/>
+                <w:bCs/>
+                <w:color w:val="FFFFFF"/>
+                <w:sz w:val="21"/>
+                <w:szCs w:val="21"/>
+                <w:rtl/>
+              </w:rPr>
+              <w:t xml:space="preserve">الإجمالي</w:t>
+            </w:r>
+          </w:p>
+        </w:tc>
+      </w:tr>
+      <w:tr>
+        <w:tc>
+          <w:tcPr>
+            <w:tcW w:w="2746" w:type="dxa"/>
+            <w:tcBorders>
+              <w:top w:val="single" w:sz="4" w:space="0" w:color="D8D0EC"/>
+              <w:left w:val="single" w:sz="4" w:space="0" w:color="D8D0EC"/>
+              <w:bottom w:val="single" w:sz="4" w:space="0" w:color="D8D0EC"/>
+              <w:right w:val="single" w:sz="4" w:space="0" w:color="D8D0EC"/>
+            </w:tcBorders>
+            <w:shd w:val="clear" w:color="auto" w:fill="F0EAFB"/>
+            <w:tcMar>
+              <w:top w:w="40" w:type="dxa"/>
+              <w:left w:w="90" w:type="dxa"/>
+              <w:bottom w:w="40" w:type="dxa"/>
+              <w:right w:w="90" w:type="dxa"/>
+            </w:tcMar>
+            <w:vAlign w:val="center"/>
+          </w:tcPr>
+          <w:p>
+            <w:pPr>
+              <w:bidi/>
+              <w:spacing w:before="26" w:after="26" w:line="252" w:lineRule="auto"/>
+              <w:jc w:val="right"/>
+            </w:pPr>
+            <w:r>
+              <w:rPr>
+                <w:rFonts w:ascii="Cairo" w:hAnsi="Cairo" w:cs="Cairo"/>
+                <w:b/>
+                <w:bCs/>
+                <w:color w:val="3A3A4A"/>
+                <w:sz w:val="20"/>
+                <w:szCs w:val="20"/>
+                <w:rtl/>
+              </w:rPr>
+              <w:t xml:space="preserve">المرحلة الأولى</w:t>
+            </w:r>
+          </w:p>
+        </w:tc>
+        <w:tc>
+          <w:tcPr>
+            <w:tcW w:w="2200" w:type="dxa"/>
+            <w:tcBorders>
+              <w:top w:val="single" w:sz="4" w:space="0" w:color="D8D0EC"/>
+              <w:left w:val="single" w:sz="4" w:space="0" w:color="D8D0EC"/>
+              <w:bottom w:val="single" w:sz="4" w:space="0" w:color="D8D0EC"/>
+              <w:right w:val="single" w:sz="4" w:space="0" w:color="D8D0EC"/>
+            </w:tcBorders>
+            <w:shd w:val="clear" w:color="auto" w:fill="F0EAFB"/>
+            <w:tcMar>
+              <w:top w:w="40" w:type="dxa"/>
+              <w:left w:w="90" w:type="dxa"/>
+              <w:bottom w:w="40" w:type="dxa"/>
+              <w:right w:w="90" w:type="dxa"/>
+            </w:tcMar>
+            <w:vAlign w:val="center"/>
+          </w:tcPr>
+          <w:p>
+            <w:pPr>
+              <w:bidi/>
+              <w:spacing w:before="26" w:after="26" w:line="252" w:lineRule="auto"/>
+              <w:jc w:val="center"/>
+            </w:pPr>
+            <w:r>
+              <w:rPr>
+                <w:rFonts w:ascii="Cairo" w:hAnsi="Cairo" w:cs="Cairo"/>
+                <w:color w:val="3A3A4A"/>
+                <w:sz w:val="20"/>
+                <w:szCs w:val="20"/>
+                <w:rtl/>
+              </w:rPr>
+              <w:t xml:space="preserve">2,000</w:t>
+            </w:r>
+          </w:p>
+        </w:tc>
+        <w:tc>
+          <w:tcPr>
+            <w:tcW w:w="2400" w:type="dxa"/>
+            <w:tcBorders>
+              <w:top w:val="single" w:sz="4" w:space="0" w:color="D8D0EC"/>
+              <w:left w:val="single" w:sz="4" w:space="0" w:color="D8D0EC"/>
+              <w:bottom w:val="single" w:sz="4" w:space="0" w:color="D8D0EC"/>
+              <w:right w:val="single" w:sz="4" w:space="0" w:color="D8D0EC"/>
+            </w:tcBorders>
+            <w:shd w:val="clear" w:color="auto" w:fill="F0EAFB"/>
+            <w:tcMar>
+              <w:top w:w="40" w:type="dxa"/>
+              <w:left w:w="90" w:type="dxa"/>
+              <w:bottom w:w="40" w:type="dxa"/>
+              <w:right w:w="90" w:type="dxa"/>
+            </w:tcMar>
+            <w:vAlign w:val="center"/>
+          </w:tcPr>
+          <w:p>
+            <w:pPr>
+              <w:bidi/>
+              <w:spacing w:before="26" w:after="26" w:line="252" w:lineRule="auto"/>
+              <w:jc w:val="center"/>
+            </w:pPr>
+            <w:r>
+              <w:rPr>
+                <w:rFonts w:ascii="Cairo" w:hAnsi="Cairo" w:cs="Cairo"/>
+                <w:color w:val="3A3A4A"/>
+                <w:sz w:val="20"/>
+                <w:szCs w:val="20"/>
+                <w:rtl/>
+              </w:rPr>
+              <w:t xml:space="preserve">300</w:t>
+            </w:r>
+          </w:p>
+        </w:tc>
+        <w:tc>
+          <w:tcPr>
+            <w:tcW w:w="2400" w:type="dxa"/>
+            <w:tcBorders>
+              <w:top w:val="single" w:sz="4" w:space="0" w:color="D8D0EC"/>
+              <w:left w:val="single" w:sz="4" w:space="0" w:color="D8D0EC"/>
+              <w:bottom w:val="single" w:sz="4" w:space="0" w:color="D8D0EC"/>
+              <w:right w:val="single" w:sz="4" w:space="0" w:color="D8D0EC"/>
+            </w:tcBorders>
+            <w:shd w:val="clear" w:color="auto" w:fill="F0EAFB"/>
+            <w:tcMar>
+              <w:top w:w="40" w:type="dxa"/>
+              <w:left w:w="90" w:type="dxa"/>
+              <w:bottom w:w="40" w:type="dxa"/>
+              <w:right w:w="90" w:type="dxa"/>
+            </w:tcMar>
+            <w:vAlign w:val="center"/>
+          </w:tcPr>
+          <w:p>
+            <w:pPr>
+              <w:bidi/>
+              <w:spacing w:before="26" w:after="26" w:line="252" w:lineRule="auto"/>
               <w:jc w:val="center"/>
             </w:pPr>
             <w:r>
@@ -1503,82 +947,148 @@
                 <w:b/>
                 <w:bCs/>
                 <w:color w:val="F4612C"/>
-                <w:sz w:val="48"/>
-                <w:szCs w:val="48"/>
+                <w:sz w:val="20"/>
+                <w:szCs w:val="20"/>
                 <w:rtl/>
               </w:rPr>
-              <w:t xml:space="preserve">3,900</w:t>
+              <w:t xml:space="preserve">2,300</w:t>
             </w:r>
+          </w:p>
+        </w:tc>
+      </w:tr>
+      <w:tr>
+        <w:tc>
+          <w:tcPr>
+            <w:tcW w:w="2746" w:type="dxa"/>
+            <w:tcBorders>
+              <w:top w:val="single" w:sz="4" w:space="0" w:color="D8D0EC"/>
+              <w:left w:val="single" w:sz="4" w:space="0" w:color="D8D0EC"/>
+              <w:bottom w:val="single" w:sz="4" w:space="0" w:color="D8D0EC"/>
+              <w:right w:val="single" w:sz="4" w:space="0" w:color="D8D0EC"/>
+            </w:tcBorders>
+            <w:shd w:val="clear" w:color="auto" w:fill="FFFFFF"/>
+            <w:tcMar>
+              <w:top w:w="40" w:type="dxa"/>
+              <w:left w:w="90" w:type="dxa"/>
+              <w:bottom w:w="40" w:type="dxa"/>
+              <w:right w:w="90" w:type="dxa"/>
+            </w:tcMar>
+            <w:vAlign w:val="center"/>
+          </w:tcPr>
+          <w:p>
+            <w:pPr>
+              <w:bidi/>
+              <w:spacing w:before="26" w:after="26" w:line="252" w:lineRule="auto"/>
+              <w:jc w:val="right"/>
+            </w:pPr>
             <w:r>
               <w:rPr>
                 <w:rFonts w:ascii="Cairo" w:hAnsi="Cairo" w:cs="Cairo"/>
                 <w:b/>
                 <w:bCs/>
-                <w:color w:val="F4612C"/>
-                <w:sz w:val="24"/>
-                <w:szCs w:val="24"/>
+                <w:color w:val="3A3A4A"/>
+                <w:sz w:val="20"/>
+                <w:szCs w:val="20"/>
                 <w:rtl/>
               </w:rPr>
-              <w:t xml:space="preserve"> ريال</w:t>
+              <w:t xml:space="preserve">المرحلة الثانية</w:t>
             </w:r>
           </w:p>
+        </w:tc>
+        <w:tc>
+          <w:tcPr>
+            <w:tcW w:w="2200" w:type="dxa"/>
+            <w:tcBorders>
+              <w:top w:val="single" w:sz="4" w:space="0" w:color="D8D0EC"/>
+              <w:left w:val="single" w:sz="4" w:space="0" w:color="D8D0EC"/>
+              <w:bottom w:val="single" w:sz="4" w:space="0" w:color="D8D0EC"/>
+              <w:right w:val="single" w:sz="4" w:space="0" w:color="D8D0EC"/>
+            </w:tcBorders>
+            <w:shd w:val="clear" w:color="auto" w:fill="FFFFFF"/>
+            <w:tcMar>
+              <w:top w:w="40" w:type="dxa"/>
+              <w:left w:w="90" w:type="dxa"/>
+              <w:bottom w:w="40" w:type="dxa"/>
+              <w:right w:w="90" w:type="dxa"/>
+            </w:tcMar>
+            <w:vAlign w:val="center"/>
+          </w:tcPr>
           <w:p>
             <w:pPr>
               <w:bidi/>
-              <w:spacing w:before="0" w:after="20" w:line="240" w:lineRule="auto"/>
+              <w:spacing w:before="26" w:after="26" w:line="252" w:lineRule="auto"/>
               <w:jc w:val="center"/>
             </w:pPr>
             <w:r>
               <w:rPr>
                 <w:rFonts w:ascii="Cairo" w:hAnsi="Cairo" w:cs="Cairo"/>
                 <w:color w:val="3A3A4A"/>
-                <w:sz w:val="17"/>
-                <w:szCs w:val="17"/>
+                <w:sz w:val="20"/>
+                <w:szCs w:val="20"/>
                 <w:rtl/>
               </w:rPr>
-              <w:t xml:space="preserve">إنتاج + تنفيذ + إدارة الحملة 30 يوماً</w:t>
+              <w:t xml:space="preserve">2,000</w:t>
             </w:r>
           </w:p>
         </w:tc>
         <w:tc>
           <w:tcPr>
-            <w:tcW w:w="520" w:type="dxa"/>
+            <w:tcW w:w="2400" w:type="dxa"/>
             <w:tcBorders>
-              <w:top w:val="nil"/>
-              <w:left w:val="nil"/>
-              <w:bottom w:val="nil"/>
-              <w:right w:val="nil"/>
+              <w:top w:val="single" w:sz="4" w:space="0" w:color="D8D0EC"/>
+              <w:left w:val="single" w:sz="4" w:space="0" w:color="D8D0EC"/>
+              <w:bottom w:val="single" w:sz="4" w:space="0" w:color="D8D0EC"/>
+              <w:right w:val="single" w:sz="4" w:space="0" w:color="D8D0EC"/>
             </w:tcBorders>
-          </w:tcPr>
-          <w:p>
-            <w:pPr>
-              <w:bidi/>
-              <w:spacing w:after="0" w:line="60" w:lineRule="exact"/>
-            </w:pPr>
-          </w:p>
-        </w:tc>
-        <w:tc>
-          <w:tcPr>
-            <w:tcW w:w="4560" w:type="dxa"/>
-            <w:tcBorders>
-              <w:top w:val="single" w:sz="14" w:space="0" w:color="4A1FA0"/>
-              <w:left w:val="single" w:sz="14" w:space="0" w:color="4A1FA0"/>
-              <w:bottom w:val="single" w:sz="14" w:space="0" w:color="4A1FA0"/>
-              <w:right w:val="single" w:sz="14" w:space="0" w:color="4A1FA0"/>
-            </w:tcBorders>
-            <w:shd w:val="clear" w:color="auto" w:fill="F0EAFB"/>
+            <w:shd w:val="clear" w:color="auto" w:fill="FFFFFF"/>
             <w:tcMar>
-              <w:top w:w="140" w:type="dxa"/>
-              <w:left w:w="120" w:type="dxa"/>
-              <w:bottom w:w="140" w:type="dxa"/>
-              <w:right w:w="120" w:type="dxa"/>
+              <w:top w:w="40" w:type="dxa"/>
+              <w:left w:w="90" w:type="dxa"/>
+              <w:bottom w:w="40" w:type="dxa"/>
+              <w:right w:w="90" w:type="dxa"/>
             </w:tcMar>
             <w:vAlign w:val="center"/>
           </w:tcPr>
           <w:p>
             <w:pPr>
               <w:bidi/>
-              <w:spacing w:before="20" w:after="20" w:line="300" w:lineRule="auto"/>
+              <w:spacing w:before="26" w:after="26" w:line="252" w:lineRule="auto"/>
+              <w:jc w:val="center"/>
+            </w:pPr>
+            <w:r>
+              <w:rPr>
+                <w:rFonts w:ascii="Cairo" w:hAnsi="Cairo" w:cs="Cairo"/>
+                <w:color w:val="3A3A4A"/>
+                <w:sz w:val="20"/>
+                <w:szCs w:val="20"/>
+                <w:rtl/>
+              </w:rPr>
+              <w:t xml:space="preserve">300</w:t>
+            </w:r>
+          </w:p>
+        </w:tc>
+        <w:tc>
+          <w:tcPr>
+            <w:tcW w:w="2400" w:type="dxa"/>
+            <w:tcBorders>
+              <w:top w:val="single" w:sz="4" w:space="0" w:color="D8D0EC"/>
+              <w:left w:val="single" w:sz="4" w:space="0" w:color="D8D0EC"/>
+              <w:bottom w:val="single" w:sz="4" w:space="0" w:color="D8D0EC"/>
+              <w:right w:val="single" w:sz="4" w:space="0" w:color="D8D0EC"/>
+            </w:tcBorders>
+            <w:shd w:val="clear" w:color="auto" w:fill="FFFFFF"/>
+            <w:tcMar>
+              <w:top w:w="40" w:type="dxa"/>
+              <w:left w:w="90" w:type="dxa"/>
+              <w:bottom w:w="40" w:type="dxa"/>
+              <w:right w:w="90" w:type="dxa"/>
+            </w:tcMar>
+            <w:vAlign w:val="center"/>
+          </w:tcPr>
+          <w:p>
+            <w:pPr>
+              <w:bidi/>
+              <w:spacing w:before="26" w:after="26" w:line="252" w:lineRule="auto"/>
               <w:jc w:val="center"/>
             </w:pPr>
             <w:r>
@@ -1587,17 +1097,148 @@
                 <w:b/>
                 <w:bCs/>
                 <w:color w:val="F4612C"/>
-                <w:sz w:val="22"/>
-                <w:szCs w:val="22"/>
+                <w:sz w:val="20"/>
+                <w:szCs w:val="20"/>
                 <w:rtl/>
               </w:rPr>
-              <w:t xml:space="preserve">عمولة النجاح</w:t>
+              <w:t xml:space="preserve">2,300</w:t>
             </w:r>
           </w:p>
+        </w:tc>
+      </w:tr>
+      <w:tr>
+        <w:tc>
+          <w:tcPr>
+            <w:tcW w:w="2746" w:type="dxa"/>
+            <w:tcBorders>
+              <w:top w:val="single" w:sz="4" w:space="0" w:color="D8D0EC"/>
+              <w:left w:val="single" w:sz="4" w:space="0" w:color="D8D0EC"/>
+              <w:bottom w:val="single" w:sz="4" w:space="0" w:color="D8D0EC"/>
+              <w:right w:val="single" w:sz="4" w:space="0" w:color="D8D0EC"/>
+            </w:tcBorders>
+            <w:shd w:val="clear" w:color="auto" w:fill="F0EAFB"/>
+            <w:tcMar>
+              <w:top w:w="40" w:type="dxa"/>
+              <w:left w:w="90" w:type="dxa"/>
+              <w:bottom w:w="40" w:type="dxa"/>
+              <w:right w:w="90" w:type="dxa"/>
+            </w:tcMar>
+            <w:vAlign w:val="center"/>
+          </w:tcPr>
           <w:p>
             <w:pPr>
               <w:bidi/>
-              <w:spacing w:before="0" w:after="20" w:line="560" w:lineRule="auto"/>
+              <w:spacing w:before="26" w:after="26" w:line="252" w:lineRule="auto"/>
+              <w:jc w:val="right"/>
+            </w:pPr>
+            <w:r>
+              <w:rPr>
+                <w:rFonts w:ascii="Cairo" w:hAnsi="Cairo" w:cs="Cairo"/>
+                <w:b/>
+                <w:bCs/>
+                <w:color w:val="3A3A4A"/>
+                <w:sz w:val="20"/>
+                <w:szCs w:val="20"/>
+                <w:rtl/>
+              </w:rPr>
+              <w:t xml:space="preserve">المرحلة الثالثة</w:t>
+            </w:r>
+          </w:p>
+        </w:tc>
+        <w:tc>
+          <w:tcPr>
+            <w:tcW w:w="2200" w:type="dxa"/>
+            <w:tcBorders>
+              <w:top w:val="single" w:sz="4" w:space="0" w:color="D8D0EC"/>
+              <w:left w:val="single" w:sz="4" w:space="0" w:color="D8D0EC"/>
+              <w:bottom w:val="single" w:sz="4" w:space="0" w:color="D8D0EC"/>
+              <w:right w:val="single" w:sz="4" w:space="0" w:color="D8D0EC"/>
+            </w:tcBorders>
+            <w:shd w:val="clear" w:color="auto" w:fill="F0EAFB"/>
+            <w:tcMar>
+              <w:top w:w="40" w:type="dxa"/>
+              <w:left w:w="90" w:type="dxa"/>
+              <w:bottom w:w="40" w:type="dxa"/>
+              <w:right w:w="90" w:type="dxa"/>
+            </w:tcMar>
+            <w:vAlign w:val="center"/>
+          </w:tcPr>
+          <w:p>
+            <w:pPr>
+              <w:bidi/>
+              <w:spacing w:before="26" w:after="26" w:line="252" w:lineRule="auto"/>
+              <w:jc w:val="center"/>
+            </w:pPr>
+            <w:r>
+              <w:rPr>
+                <w:rFonts w:ascii="Cairo" w:hAnsi="Cairo" w:cs="Cairo"/>
+                <w:color w:val="3A3A4A"/>
+                <w:sz w:val="20"/>
+                <w:szCs w:val="20"/>
+                <w:rtl/>
+              </w:rPr>
+              <w:t xml:space="preserve">2,000</w:t>
+            </w:r>
+          </w:p>
+        </w:tc>
+        <w:tc>
+          <w:tcPr>
+            <w:tcW w:w="2400" w:type="dxa"/>
+            <w:tcBorders>
+              <w:top w:val="single" w:sz="4" w:space="0" w:color="D8D0EC"/>
+              <w:left w:val="single" w:sz="4" w:space="0" w:color="D8D0EC"/>
+              <w:bottom w:val="single" w:sz="4" w:space="0" w:color="D8D0EC"/>
+              <w:right w:val="single" w:sz="4" w:space="0" w:color="D8D0EC"/>
+            </w:tcBorders>
+            <w:shd w:val="clear" w:color="auto" w:fill="F0EAFB"/>
+            <w:tcMar>
+              <w:top w:w="40" w:type="dxa"/>
+              <w:left w:w="90" w:type="dxa"/>
+              <w:bottom w:w="40" w:type="dxa"/>
+              <w:right w:w="90" w:type="dxa"/>
+            </w:tcMar>
+            <w:vAlign w:val="center"/>
+          </w:tcPr>
+          <w:p>
+            <w:pPr>
+              <w:bidi/>
+              <w:spacing w:before="26" w:after="26" w:line="252" w:lineRule="auto"/>
+              <w:jc w:val="center"/>
+            </w:pPr>
+            <w:r>
+              <w:rPr>
+                <w:rFonts w:ascii="Cairo" w:hAnsi="Cairo" w:cs="Cairo"/>
+                <w:color w:val="3A3A4A"/>
+                <w:sz w:val="20"/>
+                <w:szCs w:val="20"/>
+                <w:rtl/>
+              </w:rPr>
+              <w:t xml:space="preserve">300</w:t>
+            </w:r>
+          </w:p>
+        </w:tc>
+        <w:tc>
+          <w:tcPr>
+            <w:tcW w:w="2400" w:type="dxa"/>
+            <w:tcBorders>
+              <w:top w:val="single" w:sz="4" w:space="0" w:color="D8D0EC"/>
+              <w:left w:val="single" w:sz="4" w:space="0" w:color="D8D0EC"/>
+              <w:bottom w:val="single" w:sz="4" w:space="0" w:color="D8D0EC"/>
+              <w:right w:val="single" w:sz="4" w:space="0" w:color="D8D0EC"/>
+            </w:tcBorders>
+            <w:shd w:val="clear" w:color="auto" w:fill="F0EAFB"/>
+            <w:tcMar>
+              <w:top w:w="40" w:type="dxa"/>
+              <w:left w:w="90" w:type="dxa"/>
+              <w:bottom w:w="40" w:type="dxa"/>
+              <w:right w:w="90" w:type="dxa"/>
+            </w:tcMar>
+            <w:vAlign w:val="center"/>
+          </w:tcPr>
+          <w:p>
+            <w:pPr>
+              <w:bidi/>
+              <w:spacing w:before="26" w:after="26" w:line="252" w:lineRule="auto"/>
               <w:jc w:val="center"/>
             </w:pPr>
             <w:r>
@@ -1605,29 +1246,166 @@
                 <w:rFonts w:ascii="Cairo" w:hAnsi="Cairo" w:cs="Cairo"/>
                 <w:b/>
                 <w:bCs/>
-                <w:color w:val="4A1FA0"/>
-                <w:sz w:val="48"/>
-                <w:szCs w:val="48"/>
+                <w:color w:val="F4612C"/>
+                <w:sz w:val="20"/>
+                <w:szCs w:val="20"/>
                 <w:rtl/>
               </w:rPr>
-              <w:t xml:space="preserve">10%</w:t>
+              <w:t xml:space="preserve">2,300</w:t>
             </w:r>
           </w:p>
+        </w:tc>
+      </w:tr>
+      <w:tr>
+        <w:tc>
+          <w:tcPr>
+            <w:tcW w:w="2746" w:type="dxa"/>
+            <w:tcBorders>
+              <w:top w:val="single" w:sz="4" w:space="0" w:color="D8D0EC"/>
+              <w:left w:val="single" w:sz="4" w:space="0" w:color="D8D0EC"/>
+              <w:bottom w:val="single" w:sz="4" w:space="0" w:color="D8D0EC"/>
+              <w:right w:val="single" w:sz="4" w:space="0" w:color="D8D0EC"/>
+            </w:tcBorders>
+            <w:shd w:val="clear" w:color="auto" w:fill="F4612C"/>
+            <w:tcMar>
+              <w:top w:w="40" w:type="dxa"/>
+              <w:left w:w="90" w:type="dxa"/>
+              <w:bottom w:w="40" w:type="dxa"/>
+              <w:right w:w="90" w:type="dxa"/>
+            </w:tcMar>
+            <w:vAlign w:val="center"/>
+          </w:tcPr>
           <w:p>
             <w:pPr>
               <w:bidi/>
-              <w:spacing w:before="0" w:after="20" w:line="240" w:lineRule="auto"/>
+              <w:spacing w:before="26" w:after="26" w:line="252" w:lineRule="auto"/>
+              <w:jc w:val="right"/>
+            </w:pPr>
+            <w:r>
+              <w:rPr>
+                <w:rFonts w:ascii="Cairo" w:hAnsi="Cairo" w:cs="Cairo"/>
+                <w:b/>
+                <w:bCs/>
+                <w:color w:val="FFFFFF"/>
+                <w:sz w:val="22"/>
+                <w:szCs w:val="22"/>
+                <w:rtl/>
+              </w:rPr>
+              <w:t xml:space="preserve">الإجمالي</w:t>
+            </w:r>
+          </w:p>
+        </w:tc>
+        <w:tc>
+          <w:tcPr>
+            <w:tcW w:w="2200" w:type="dxa"/>
+            <w:tcBorders>
+              <w:top w:val="single" w:sz="4" w:space="0" w:color="D8D0EC"/>
+              <w:left w:val="single" w:sz="4" w:space="0" w:color="D8D0EC"/>
+              <w:bottom w:val="single" w:sz="4" w:space="0" w:color="D8D0EC"/>
+              <w:right w:val="single" w:sz="4" w:space="0" w:color="D8D0EC"/>
+            </w:tcBorders>
+            <w:shd w:val="clear" w:color="auto" w:fill="F4612C"/>
+            <w:tcMar>
+              <w:top w:w="40" w:type="dxa"/>
+              <w:left w:w="90" w:type="dxa"/>
+              <w:bottom w:w="40" w:type="dxa"/>
+              <w:right w:w="90" w:type="dxa"/>
+            </w:tcMar>
+            <w:vAlign w:val="center"/>
+          </w:tcPr>
+          <w:p>
+            <w:pPr>
+              <w:bidi/>
+              <w:spacing w:before="26" w:after="26" w:line="252" w:lineRule="auto"/>
               <w:jc w:val="center"/>
             </w:pPr>
             <w:r>
               <w:rPr>
                 <w:rFonts w:ascii="Cairo" w:hAnsi="Cairo" w:cs="Cairo"/>
-                <w:color w:val="3A3A4A"/>
-                <w:sz w:val="17"/>
-                <w:szCs w:val="17"/>
+                <w:b/>
+                <w:bCs/>
+                <w:color w:val="FFFFFF"/>
+                <w:sz w:val="22"/>
+                <w:szCs w:val="22"/>
                 <w:rtl/>
               </w:rPr>
-              <w:t xml:space="preserve">لكل طالب جديد يُسجَّل عبر الموقع</w:t>
+              <w:t xml:space="preserve">6,000</w:t>
+            </w:r>
+          </w:p>
+        </w:tc>
+        <w:tc>
+          <w:tcPr>
+            <w:tcW w:w="2400" w:type="dxa"/>
+            <w:tcBorders>
+              <w:top w:val="single" w:sz="4" w:space="0" w:color="D8D0EC"/>
+              <w:left w:val="single" w:sz="4" w:space="0" w:color="D8D0EC"/>
+              <w:bottom w:val="single" w:sz="4" w:space="0" w:color="D8D0EC"/>
+              <w:right w:val="single" w:sz="4" w:space="0" w:color="D8D0EC"/>
+            </w:tcBorders>
+            <w:shd w:val="clear" w:color="auto" w:fill="F4612C"/>
+            <w:tcMar>
+              <w:top w:w="40" w:type="dxa"/>
+              <w:left w:w="90" w:type="dxa"/>
+              <w:bottom w:w="40" w:type="dxa"/>
+              <w:right w:w="90" w:type="dxa"/>
+            </w:tcMar>
+            <w:vAlign w:val="center"/>
+          </w:tcPr>
+          <w:p>
+            <w:pPr>
+              <w:bidi/>
+              <w:spacing w:before="26" w:after="26" w:line="252" w:lineRule="auto"/>
+              <w:jc w:val="center"/>
+            </w:pPr>
+            <w:r>
+              <w:rPr>
+                <w:rFonts w:ascii="Cairo" w:hAnsi="Cairo" w:cs="Cairo"/>
+                <w:b/>
+                <w:bCs/>
+                <w:color w:val="FFFFFF"/>
+                <w:sz w:val="22"/>
+                <w:szCs w:val="22"/>
+                <w:rtl/>
+              </w:rPr>
+              <w:t xml:space="preserve">900</w:t>
+            </w:r>
+          </w:p>
+        </w:tc>
+        <w:tc>
+          <w:tcPr>
+            <w:tcW w:w="2400" w:type="dxa"/>
+            <w:tcBorders>
+              <w:top w:val="single" w:sz="4" w:space="0" w:color="D8D0EC"/>
+              <w:left w:val="single" w:sz="4" w:space="0" w:color="D8D0EC"/>
+              <w:bottom w:val="single" w:sz="4" w:space="0" w:color="D8D0EC"/>
+              <w:right w:val="single" w:sz="4" w:space="0" w:color="D8D0EC"/>
+            </w:tcBorders>
+            <w:shd w:val="clear" w:color="auto" w:fill="F4612C"/>
+            <w:tcMar>
+              <w:top w:w="40" w:type="dxa"/>
+              <w:left w:w="90" w:type="dxa"/>
+              <w:bottom w:w="40" w:type="dxa"/>
+              <w:right w:w="90" w:type="dxa"/>
+            </w:tcMar>
+            <w:vAlign w:val="center"/>
+          </w:tcPr>
+          <w:p>
+            <w:pPr>
+              <w:bidi/>
+              <w:spacing w:before="26" w:after="26" w:line="252" w:lineRule="auto"/>
+              <w:jc w:val="center"/>
+            </w:pPr>
+            <w:r>
+              <w:rPr>
+                <w:rFonts w:ascii="Cairo" w:hAnsi="Cairo" w:cs="Cairo"/>
+                <w:b/>
+                <w:bCs/>
+                <w:color w:val="FFFFFF"/>
+                <w:sz w:val="22"/>
+                <w:szCs w:val="22"/>
+                <w:rtl/>
+              </w:rPr>
+              <w:t xml:space="preserve">6,900 ريال</w:t>
             </w:r>
           </w:p>
         </w:tc>
@@ -1635,23 +1413,6 @@
     </w:tbl>
     <w:p>
       <w:pPr>
-        <w:bidi/>
-        <w:spacing w:before="120" w:after="40" w:line="260" w:lineRule="auto"/>
-        <w:jc w:val="center"/>
-      </w:pPr>
-      <w:r>
-        <w:rPr>
-          <w:rFonts w:ascii="Cairo" w:hAnsi="Cairo" w:cs="Cairo"/>
-          <w:color w:val="3A3A4A"/>
-          <w:sz w:val="18"/>
-          <w:szCs w:val="18"/>
-          <w:rtl/>
-        </w:rPr>
-        <w:t xml:space="preserve">تُحتسب عمولة النجاح من رسوم التسجيل لكل طالب جديد يُسجَّل فعلياً عبر نموذج الموقع، مع تقرير دوري بأعداد المسجَّلين.</w:t>
-      </w:r>
-    </w:p>
-    <w:p>
-      <w:pPr>
         <w:shd w:val="clear" w:color="auto" w:fill="4A1FA0"/>
         <w:bidi/>
         <w:spacing w:before="140" w:after="60" w:line="300" w:lineRule="auto"/>
@@ -1668,7 +1429,7 @@
           <w:szCs w:val="24"/>
           <w:rtl/>
         </w:rPr>
-        <w:t xml:space="preserve">يشمل العرض</w:t>
+        <w:t xml:space="preserve">آلية الدفع</w:t>
       </w:r>
     </w:p>
     <w:p>
@@ -1699,7 +1460,28 @@
           <w:szCs w:val="22"/>
           <w:rtl/>
         </w:rPr>
-        <w:t xml:space="preserve">التخطيط الإبداعي وكتابة الفكرة والسيناريو.</w:t>
+        <w:t xml:space="preserve">تُدفع قيمة كل مرحلة كاملةً (2,300 ريال شاملة الضريبة) قبل البدء في تنفيذها.</w:t>
+      </w:r>
+    </w:p>
+    <w:p>
+      <w:pPr>
+        <w:shd w:val="clear" w:color="auto" w:fill="F4612C"/>
+        <w:bidi/>
+        <w:spacing w:before="140" w:after="60" w:line="300" w:lineRule="auto"/>
+        <w:ind w:start="200" w:end="200"/>
+        <w:jc w:val="right"/>
+      </w:pPr>
+      <w:r>
+        <w:rPr>
+          <w:rFonts w:ascii="Cairo" w:hAnsi="Cairo" w:cs="Cairo"/>
+          <w:b/>
+          <w:bCs/>
+          <w:color w:val="FFFFFF"/>
+          <w:sz w:val="24"/>
+          <w:szCs w:val="24"/>
+          <w:rtl/>
+        </w:rPr>
+        <w:t xml:space="preserve">لا يشمل العرض</w:t>
       </w:r>
     </w:p>
     <w:p>
@@ -1715,7 +1497,7 @@
           <w:rFonts w:ascii="Cairo" w:hAnsi="Cairo" w:cs="Cairo"/>
           <w:b/>
           <w:bCs/>
-          <w:color w:val="4A1FA0"/>
+          <w:color w:val="F4612C"/>
           <w:sz w:val="22"/>
           <w:szCs w:val="22"/>
           <w:rtl/>
@@ -1730,7 +1512,28 @@
           <w:szCs w:val="22"/>
           <w:rtl/>
         </w:rPr>
-        <w:t xml:space="preserve">تصوير الفيديو والمونتاج الاحترافي.</w:t>
+        <w:t xml:space="preserve">ميزانية الإعلانات المدفوعة للمنصّات (تتحمّلها المدرسة).</w:t>
+      </w:r>
+    </w:p>
+    <w:p>
+      <w:pPr>
+        <w:shd w:val="clear" w:color="auto" w:fill="4A1FA0"/>
+        <w:bidi/>
+        <w:spacing w:before="140" w:after="60" w:line="300" w:lineRule="auto"/>
+        <w:ind w:start="200" w:end="200"/>
+        <w:jc w:val="right"/>
+      </w:pPr>
+      <w:r>
+        <w:rPr>
+          <w:rFonts w:ascii="Cairo" w:hAnsi="Cairo" w:cs="Cairo"/>
+          <w:b/>
+          <w:bCs/>
+          <w:color w:val="FFFFFF"/>
+          <w:sz w:val="24"/>
+          <w:szCs w:val="24"/>
+          <w:rtl/>
+        </w:rPr>
+        <w:t xml:space="preserve">ملاحظة مهمة</w:t>
       </w:r>
     </w:p>
     <w:p>
@@ -1761,7 +1564,7 @@
           <w:szCs w:val="22"/>
           <w:rtl/>
         </w:rPr>
-        <w:t xml:space="preserve">تصميم صفحة الهبوط وإنشاء نموذج التسجيل.</w:t>
+        <w:t xml:space="preserve">نموذج عمل مستمر يرافق المدرسة طوال العام ولكل موسم تسجيل، وليس حملةً مؤقتة.</w:t>
       </w:r>
     </w:p>
     <w:p>
@@ -1792,247 +1595,19 @@
           <w:szCs w:val="22"/>
           <w:rtl/>
         </w:rPr>
-        <w:t xml:space="preserve">إعداد وإطلاق الحملات الإعلانية.</w:t>
-      </w:r>
-    </w:p>
-    <w:p>
-      <w:pPr>
-        <w:bidi/>
-        <w:spacing w:before="18" w:after="18" w:line="252" w:lineRule="auto"/>
-        <w:ind w:start="360" w:hanging="280"/>
-        <w:contextualSpacing/>
-        <w:jc w:val="right"/>
-      </w:pPr>
-      <w:r>
-        <w:rPr>
-          <w:rFonts w:ascii="Cairo" w:hAnsi="Cairo" w:cs="Cairo"/>
-          <w:b/>
-          <w:bCs/>
-          <w:color w:val="4A1FA0"/>
-          <w:sz w:val="22"/>
-          <w:szCs w:val="22"/>
-          <w:rtl/>
-        </w:rPr>
-        <w:t xml:space="preserve">•  </w:t>
-      </w:r>
-      <w:r>
-        <w:rPr>
-          <w:rFonts w:ascii="Cairo" w:hAnsi="Cairo" w:cs="Cairo"/>
-          <w:color w:val="3A3A4A"/>
-          <w:sz w:val="22"/>
-          <w:szCs w:val="22"/>
-          <w:rtl/>
-        </w:rPr>
-        <w:t xml:space="preserve">إدارة الحملة لمدة 30 يوماً.</w:t>
-      </w:r>
-    </w:p>
-    <w:p>
-      <w:pPr>
-        <w:bidi/>
-        <w:spacing w:before="18" w:after="18" w:line="252" w:lineRule="auto"/>
-        <w:ind w:start="360" w:hanging="280"/>
-        <w:contextualSpacing/>
-        <w:jc w:val="right"/>
-      </w:pPr>
-      <w:r>
-        <w:rPr>
-          <w:rFonts w:ascii="Cairo" w:hAnsi="Cairo" w:cs="Cairo"/>
-          <w:b/>
-          <w:bCs/>
-          <w:color w:val="4A1FA0"/>
-          <w:sz w:val="22"/>
-          <w:szCs w:val="22"/>
-          <w:rtl/>
-        </w:rPr>
-        <w:t xml:space="preserve">•  </w:t>
-      </w:r>
-      <w:r>
-        <w:rPr>
-          <w:rFonts w:ascii="Cairo" w:hAnsi="Cairo" w:cs="Cairo"/>
-          <w:color w:val="3A3A4A"/>
-          <w:sz w:val="22"/>
-          <w:szCs w:val="22"/>
-          <w:rtl/>
-        </w:rPr>
-        <w:t xml:space="preserve">التقرير النهائي.</w:t>
-      </w:r>
-    </w:p>
-    <w:p>
-      <w:pPr>
-        <w:shd w:val="clear" w:color="auto" w:fill="F4612C"/>
-        <w:bidi/>
-        <w:spacing w:before="140" w:after="60" w:line="300" w:lineRule="auto"/>
-        <w:ind w:start="200" w:end="200"/>
-        <w:jc w:val="right"/>
-      </w:pPr>
-      <w:r>
-        <w:rPr>
-          <w:rFonts w:ascii="Cairo" w:hAnsi="Cairo" w:cs="Cairo"/>
-          <w:b/>
-          <w:bCs/>
-          <w:color w:val="FFFFFF"/>
-          <w:sz w:val="24"/>
-          <w:szCs w:val="24"/>
-          <w:rtl/>
-        </w:rPr>
-        <w:t xml:space="preserve">لا يشمل العرض</w:t>
-      </w:r>
-    </w:p>
-    <w:p>
-      <w:pPr>
-        <w:bidi/>
-        <w:spacing w:before="18" w:after="18" w:line="252" w:lineRule="auto"/>
-        <w:ind w:start="360" w:hanging="280"/>
-        <w:contextualSpacing/>
-        <w:jc w:val="right"/>
-      </w:pPr>
-      <w:r>
-        <w:rPr>
-          <w:rFonts w:ascii="Cairo" w:hAnsi="Cairo" w:cs="Cairo"/>
-          <w:b/>
-          <w:bCs/>
-          <w:color w:val="F4612C"/>
-          <w:sz w:val="22"/>
-          <w:szCs w:val="22"/>
-          <w:rtl/>
-        </w:rPr>
-        <w:t xml:space="preserve">•  </w:t>
-      </w:r>
-      <w:r>
-        <w:rPr>
-          <w:rFonts w:ascii="Cairo" w:hAnsi="Cairo" w:cs="Cairo"/>
-          <w:color w:val="3A3A4A"/>
-          <w:sz w:val="22"/>
-          <w:szCs w:val="22"/>
-          <w:rtl/>
-        </w:rPr>
-        <w:t xml:space="preserve">ميزانية الإعلانات المدفوعة للمنصّات (تتحمّلها المدرسة).</w:t>
-      </w:r>
-    </w:p>
-    <w:p>
-      <w:pPr>
-        <w:shd w:val="clear" w:color="auto" w:fill="4A1FA0"/>
-        <w:bidi/>
-        <w:spacing w:before="140" w:after="60" w:line="300" w:lineRule="auto"/>
-        <w:ind w:start="200" w:end="200"/>
-        <w:jc w:val="right"/>
-      </w:pPr>
-      <w:r>
-        <w:rPr>
-          <w:rFonts w:ascii="Cairo" w:hAnsi="Cairo" w:cs="Cairo"/>
-          <w:b/>
-          <w:bCs/>
-          <w:color w:val="FFFFFF"/>
-          <w:sz w:val="24"/>
-          <w:szCs w:val="24"/>
-          <w:rtl/>
-        </w:rPr>
-        <w:t xml:space="preserve">آلية الدفع</w:t>
-      </w:r>
-    </w:p>
-    <w:p>
-      <w:pPr>
-        <w:bidi/>
-        <w:spacing w:before="18" w:after="18" w:line="252" w:lineRule="auto"/>
-        <w:ind w:start="360" w:hanging="280"/>
-        <w:contextualSpacing/>
-        <w:jc w:val="right"/>
-      </w:pPr>
-      <w:r>
-        <w:rPr>
-          <w:rFonts w:ascii="Cairo" w:hAnsi="Cairo" w:cs="Cairo"/>
-          <w:b/>
-          <w:bCs/>
-          <w:color w:val="4A1FA0"/>
-          <w:sz w:val="22"/>
-          <w:szCs w:val="22"/>
-          <w:rtl/>
-        </w:rPr>
-        <w:t xml:space="preserve">•  </w:t>
-      </w:r>
-      <w:r>
-        <w:rPr>
-          <w:rFonts w:ascii="Cairo" w:hAnsi="Cairo" w:cs="Cairo"/>
-          <w:color w:val="3A3A4A"/>
-          <w:sz w:val="22"/>
-          <w:szCs w:val="22"/>
-          <w:rtl/>
-        </w:rPr>
-        <w:t xml:space="preserve">50% من الرسوم الثابتة عند توقيع الاتفاق.</w:t>
-      </w:r>
-    </w:p>
-    <w:p>
-      <w:pPr>
-        <w:bidi/>
-        <w:spacing w:before="18" w:after="18" w:line="252" w:lineRule="auto"/>
-        <w:ind w:start="360" w:hanging="280"/>
-        <w:contextualSpacing/>
-        <w:jc w:val="right"/>
-      </w:pPr>
-      <w:r>
-        <w:rPr>
-          <w:rFonts w:ascii="Cairo" w:hAnsi="Cairo" w:cs="Cairo"/>
-          <w:b/>
-          <w:bCs/>
-          <w:color w:val="4A1FA0"/>
-          <w:sz w:val="22"/>
-          <w:szCs w:val="22"/>
-          <w:rtl/>
-        </w:rPr>
-        <w:t xml:space="preserve">•  </w:t>
-      </w:r>
-      <w:r>
-        <w:rPr>
-          <w:rFonts w:ascii="Cairo" w:hAnsi="Cairo" w:cs="Cairo"/>
-          <w:color w:val="3A3A4A"/>
-          <w:sz w:val="22"/>
-          <w:szCs w:val="22"/>
-          <w:rtl/>
-        </w:rPr>
-        <w:t xml:space="preserve">50% عند إطلاق الحملة.</w:t>
-      </w:r>
-    </w:p>
-    <w:p>
-      <w:pPr>
-        <w:bidi/>
-        <w:spacing w:before="18" w:after="18" w:line="252" w:lineRule="auto"/>
-        <w:ind w:start="360" w:hanging="280"/>
-        <w:contextualSpacing/>
-        <w:jc w:val="right"/>
-      </w:pPr>
-      <w:r>
-        <w:rPr>
-          <w:rFonts w:ascii="Cairo" w:hAnsi="Cairo" w:cs="Cairo"/>
-          <w:b/>
-          <w:bCs/>
-          <w:color w:val="4A1FA0"/>
-          <w:sz w:val="22"/>
-          <w:szCs w:val="22"/>
-          <w:rtl/>
-        </w:rPr>
-        <w:t xml:space="preserve">•  </w:t>
-      </w:r>
-      <w:r>
-        <w:rPr>
-          <w:rFonts w:ascii="Cairo" w:hAnsi="Cairo" w:cs="Cairo"/>
-          <w:color w:val="3A3A4A"/>
-          <w:sz w:val="22"/>
-          <w:szCs w:val="22"/>
-          <w:rtl/>
-        </w:rPr>
-        <w:t xml:space="preserve">عمولة النجاح (10%) تُحتسب وتُسدَّد شهرياً وفق تقرير المسجَّلين عبر الموقع.</w:t>
-      </w:r>
-    </w:p>
-    <w:p>
-      <w:pPr>
-        <w:bidi/>
-        <w:spacing w:before="0" w:after="0" w:line="120" w:lineRule="exact"/>
-      </w:pPr>
-    </w:p>
-    <w:p>
-      <w:pPr>
-        <w:bidi/>
-        <w:spacing w:before="80" w:after="80" w:line="300" w:lineRule="auto"/>
+        <w:t xml:space="preserve">«موقع المدرسة» يظهر في بحث Google عند البحث باسمها، ويتيح التصفّح والتسجيل المباشر وإطلاق حملات Google.</w:t>
+      </w:r>
+    </w:p>
+    <w:p>
+      <w:pPr>
+        <w:bidi/>
+        <w:spacing w:before="0" w:after="0" w:line="100" w:lineRule="exact"/>
+      </w:pPr>
+    </w:p>
+    <w:p>
+      <w:pPr>
+        <w:bidi/>
+        <w:spacing w:before="60" w:after="60" w:line="300" w:lineRule="auto"/>
         <w:jc w:val="center"/>
       </w:pPr>
       <w:r>

</xml_diff>